<commit_message>
Afiche en la carpeta
</commit_message>
<xml_diff>
--- a/Entrega_Final/Informe_Final_AmatHerreraRodriguez-paper.docx
+++ b/Entrega_Final/Informe_Final_AmatHerreraRodriguez-paper.docx
@@ -1103,6 +1103,28 @@
     </w:p>
     <w:p>
       <w:pPr>
+        <w:pStyle w:val="Normal"/>
+        <w:spacing w:lineRule="auto" w:line="360" w:before="0" w:after="160"/>
+        <w:jc w:val="both"/>
+        <w:rPr/>
+      </w:pPr>
+      <w:r>
+        <w:rPr/>
+      </w:r>
+    </w:p>
+    <w:p>
+      <w:pPr>
+        <w:pStyle w:val="Normal"/>
+        <w:spacing w:lineRule="auto" w:line="360" w:before="0" w:after="160"/>
+        <w:jc w:val="both"/>
+        <w:rPr/>
+      </w:pPr>
+      <w:r>
+        <w:rPr/>
+      </w:r>
+    </w:p>
+    <w:p>
+      <w:pPr>
         <w:pStyle w:val="Heading1"/>
         <w:pBdr>
           <w:bottom w:val="single" w:sz="6" w:space="0" w:color="1F497D"/>
@@ -1140,25 +1162,6 @@
           <w:szCs w:val="24"/>
         </w:rPr>
         <w:t>El pipeline de limpieza constó de 5 etapas secuenciales que se documentan en la Tabla 2, junto con su efecto cuantitativo sobre el tamaño muestral.</w:t>
-      </w:r>
-    </w:p>
-    <w:p>
-      <w:pPr>
-        <w:pStyle w:val="Normal"/>
-        <w:spacing w:lineRule="auto" w:line="360" w:before="0" w:after="160"/>
-        <w:jc w:val="both"/>
-        <w:rPr>
-          <w:rFonts w:ascii="Times New Roman" w:hAnsi="Times New Roman" w:eastAsia="Times New Roman" w:cs="Times New Roman"/>
-          <w:sz w:val="24"/>
-          <w:szCs w:val="24"/>
-        </w:rPr>
-      </w:pPr>
-      <w:r>
-        <w:rPr>
-          <w:rFonts w:eastAsia="Times New Roman" w:cs="Times New Roman"/>
-          <w:sz w:val="24"/>
-          <w:szCs w:val="24"/>
-        </w:rPr>
       </w:r>
     </w:p>
     <w:p>
@@ -3368,9 +3371,9 @@
       <w:tblGrid>
         <w:gridCol w:w="907"/>
         <w:gridCol w:w="2721"/>
-        <w:gridCol w:w="1359"/>
+        <w:gridCol w:w="1358"/>
         <w:gridCol w:w="907"/>
-        <w:gridCol w:w="1362"/>
+        <w:gridCol w:w="1363"/>
         <w:gridCol w:w="1814"/>
       </w:tblGrid>
       <w:tr>
@@ -3437,7 +3440,7 @@
         </w:tc>
         <w:tc>
           <w:tcPr>
-            <w:tcW w:w="1359" w:type="dxa"/>
+            <w:tcW w:w="1358" w:type="dxa"/>
             <w:tcBorders>
               <w:top w:val="single" w:sz="4" w:space="0" w:color="AAAAAA"/>
               <w:start w:val="single" w:sz="4" w:space="0" w:color="AAAAAA"/>
@@ -3497,7 +3500,7 @@
         </w:tc>
         <w:tc>
           <w:tcPr>
-            <w:tcW w:w="1362" w:type="dxa"/>
+            <w:tcW w:w="1363" w:type="dxa"/>
             <w:tcBorders>
               <w:top w:val="single" w:sz="4" w:space="0" w:color="AAAAAA"/>
               <w:start w:val="single" w:sz="4" w:space="0" w:color="AAAAAA"/>
@@ -3612,7 +3615,7 @@
         </w:tc>
         <w:tc>
           <w:tcPr>
-            <w:tcW w:w="1359" w:type="dxa"/>
+            <w:tcW w:w="1358" w:type="dxa"/>
             <w:tcBorders>
               <w:top w:val="single" w:sz="4" w:space="0" w:color="AAAAAA"/>
               <w:start w:val="single" w:sz="4" w:space="0" w:color="AAAAAA"/>
@@ -3664,7 +3667,7 @@
         </w:tc>
         <w:tc>
           <w:tcPr>
-            <w:tcW w:w="1362" w:type="dxa"/>
+            <w:tcW w:w="1363" w:type="dxa"/>
             <w:tcBorders>
               <w:top w:val="single" w:sz="4" w:space="0" w:color="AAAAAA"/>
               <w:start w:val="single" w:sz="4" w:space="0" w:color="AAAAAA"/>
@@ -3771,7 +3774,7 @@
         </w:tc>
         <w:tc>
           <w:tcPr>
-            <w:tcW w:w="1359" w:type="dxa"/>
+            <w:tcW w:w="1358" w:type="dxa"/>
             <w:tcBorders>
               <w:top w:val="single" w:sz="4" w:space="0" w:color="AAAAAA"/>
               <w:start w:val="single" w:sz="4" w:space="0" w:color="AAAAAA"/>
@@ -3823,7 +3826,7 @@
         </w:tc>
         <w:tc>
           <w:tcPr>
-            <w:tcW w:w="1362" w:type="dxa"/>
+            <w:tcW w:w="1363" w:type="dxa"/>
             <w:tcBorders>
               <w:top w:val="single" w:sz="4" w:space="0" w:color="AAAAAA"/>
               <w:start w:val="single" w:sz="4" w:space="0" w:color="AAAAAA"/>
@@ -3930,7 +3933,7 @@
         </w:tc>
         <w:tc>
           <w:tcPr>
-            <w:tcW w:w="1359" w:type="dxa"/>
+            <w:tcW w:w="1358" w:type="dxa"/>
             <w:tcBorders>
               <w:top w:val="single" w:sz="4" w:space="0" w:color="AAAAAA"/>
               <w:start w:val="single" w:sz="4" w:space="0" w:color="AAAAAA"/>
@@ -3982,7 +3985,7 @@
         </w:tc>
         <w:tc>
           <w:tcPr>
-            <w:tcW w:w="1362" w:type="dxa"/>
+            <w:tcW w:w="1363" w:type="dxa"/>
             <w:tcBorders>
               <w:top w:val="single" w:sz="4" w:space="0" w:color="AAAAAA"/>
               <w:start w:val="single" w:sz="4" w:space="0" w:color="AAAAAA"/>
@@ -5216,14 +5219,70 @@
           <w:i/>
           <w:sz w:val="20"/>
         </w:rPr>
-        <w:t xml:space="preserve"> (véase Figuras A8 y A9 en Anexo para la curva ROC y el forest plot de odds ratios).</w:t>
+        <w:t xml:space="preserve"> (véase Figuras A8 y A9 en Anexo para la curva ROC y el forest plot</w:t>
+      </w:r>
+      <w:r>
+        <w:rPr>
+          <w:i/>
+          <w:sz w:val="20"/>
+        </w:rPr>
+        <w:t>de odds ratios).</w:t>
+      </w:r>
+    </w:p>
+    <w:p>
+      <w:pPr>
+        <w:pStyle w:val="Normal"/>
+        <w:spacing w:lineRule="auto" w:line="360" w:before="0" w:after="160"/>
+        <w:jc w:val="both"/>
+        <w:rPr>
+          <w:i/>
+          <w:sz w:val="20"/>
+        </w:rPr>
+      </w:pPr>
+      <w:r>
+        <w:rPr>
+          <w:i/>
+          <w:sz w:val="20"/>
+        </w:rPr>
+      </w:r>
+    </w:p>
+    <w:p>
+      <w:pPr>
+        <w:pStyle w:val="Normal"/>
+        <w:spacing w:lineRule="auto" w:line="360" w:before="0" w:after="160"/>
+        <w:jc w:val="both"/>
+        <w:rPr>
+          <w:rFonts w:eastAsia="Times New Roman" w:cs="Times New Roman"/>
+          <w:b/>
+          <w:bCs/>
+          <w:color w:val="2E4DAA"/>
+          <w:sz w:val="24"/>
+          <w:szCs w:val="24"/>
+        </w:rPr>
+      </w:pPr>
+      <w:r>
+        <w:rPr>
+          <w:rFonts w:eastAsia="Times New Roman" w:cs="Times New Roman"/>
+          <w:b/>
+          <w:bCs/>
+          <w:color w:val="2E4DAA"/>
+          <w:sz w:val="24"/>
+          <w:szCs w:val="24"/>
+        </w:rPr>
       </w:r>
     </w:p>
     <w:p>
       <w:pPr>
         <w:pStyle w:val="Heading2"/>
         <w:spacing w:before="240" w:after="120"/>
-        <w:rPr/>
+        <w:rPr>
+          <w:rFonts w:eastAsia="Times New Roman" w:cs="Times New Roman"/>
+          <w:b/>
+          <w:bCs/>
+          <w:color w:val="2E4DAA"/>
+          <w:sz w:val="24"/>
+          <w:szCs w:val="24"/>
+        </w:rPr>
       </w:pPr>
       <w:r>
         <w:rPr>
@@ -5301,8 +5360,8 @@
         </w:tblCellMar>
       </w:tblPr>
       <w:tblGrid>
-        <w:gridCol w:w="3445"/>
-        <w:gridCol w:w="1090"/>
+        <w:gridCol w:w="3444"/>
+        <w:gridCol w:w="1091"/>
         <w:gridCol w:w="907"/>
         <w:gridCol w:w="1995"/>
         <w:gridCol w:w="1633"/>
@@ -5311,7 +5370,7 @@
         <w:trPr/>
         <w:tc>
           <w:tcPr>
-            <w:tcW w:w="3445" w:type="dxa"/>
+            <w:tcW w:w="3444" w:type="dxa"/>
             <w:tcBorders>
               <w:top w:val="single" w:sz="4" w:space="0" w:color="AAAAAA"/>
               <w:start w:val="single" w:sz="4" w:space="0" w:color="AAAAAA"/>
@@ -5341,7 +5400,7 @@
         </w:tc>
         <w:tc>
           <w:tcPr>
-            <w:tcW w:w="1090" w:type="dxa"/>
+            <w:tcW w:w="1091" w:type="dxa"/>
             <w:tcBorders>
               <w:top w:val="single" w:sz="4" w:space="0" w:color="AAAAAA"/>
               <w:start w:val="single" w:sz="4" w:space="0" w:color="AAAAAA"/>
@@ -5464,7 +5523,7 @@
         <w:trPr/>
         <w:tc>
           <w:tcPr>
-            <w:tcW w:w="3445" w:type="dxa"/>
+            <w:tcW w:w="3444" w:type="dxa"/>
             <w:tcBorders>
               <w:top w:val="single" w:sz="4" w:space="0" w:color="AAAAAA"/>
               <w:start w:val="single" w:sz="4" w:space="0" w:color="AAAAAA"/>
@@ -5490,7 +5549,7 @@
         </w:tc>
         <w:tc>
           <w:tcPr>
-            <w:tcW w:w="1090" w:type="dxa"/>
+            <w:tcW w:w="1091" w:type="dxa"/>
             <w:tcBorders>
               <w:top w:val="single" w:sz="4" w:space="0" w:color="AAAAAA"/>
               <w:start w:val="single" w:sz="4" w:space="0" w:color="AAAAAA"/>
@@ -5597,7 +5656,7 @@
         <w:trPr/>
         <w:tc>
           <w:tcPr>
-            <w:tcW w:w="3445" w:type="dxa"/>
+            <w:tcW w:w="3444" w:type="dxa"/>
             <w:tcBorders>
               <w:top w:val="single" w:sz="4" w:space="0" w:color="AAAAAA"/>
               <w:start w:val="single" w:sz="4" w:space="0" w:color="AAAAAA"/>
@@ -5623,7 +5682,7 @@
         </w:tc>
         <w:tc>
           <w:tcPr>
-            <w:tcW w:w="1090" w:type="dxa"/>
+            <w:tcW w:w="1091" w:type="dxa"/>
             <w:tcBorders>
               <w:top w:val="single" w:sz="4" w:space="0" w:color="AAAAAA"/>
               <w:start w:val="single" w:sz="4" w:space="0" w:color="AAAAAA"/>
@@ -5730,7 +5789,7 @@
         <w:trPr/>
         <w:tc>
           <w:tcPr>
-            <w:tcW w:w="3445" w:type="dxa"/>
+            <w:tcW w:w="3444" w:type="dxa"/>
             <w:tcBorders>
               <w:top w:val="single" w:sz="4" w:space="0" w:color="AAAAAA"/>
               <w:start w:val="single" w:sz="4" w:space="0" w:color="AAAAAA"/>
@@ -5756,7 +5815,7 @@
         </w:tc>
         <w:tc>
           <w:tcPr>
-            <w:tcW w:w="1090" w:type="dxa"/>
+            <w:tcW w:w="1091" w:type="dxa"/>
             <w:tcBorders>
               <w:top w:val="single" w:sz="4" w:space="0" w:color="AAAAAA"/>
               <w:start w:val="single" w:sz="4" w:space="0" w:color="AAAAAA"/>
@@ -5863,7 +5922,7 @@
         <w:trPr/>
         <w:tc>
           <w:tcPr>
-            <w:tcW w:w="3445" w:type="dxa"/>
+            <w:tcW w:w="3444" w:type="dxa"/>
             <w:tcBorders>
               <w:top w:val="single" w:sz="4" w:space="0" w:color="AAAAAA"/>
               <w:start w:val="single" w:sz="4" w:space="0" w:color="AAAAAA"/>
@@ -5889,7 +5948,7 @@
         </w:tc>
         <w:tc>
           <w:tcPr>
-            <w:tcW w:w="1090" w:type="dxa"/>
+            <w:tcW w:w="1091" w:type="dxa"/>
             <w:tcBorders>
               <w:top w:val="single" w:sz="4" w:space="0" w:color="AAAAAA"/>
               <w:start w:val="single" w:sz="4" w:space="0" w:color="AAAAAA"/>
@@ -5996,7 +6055,7 @@
         <w:trPr/>
         <w:tc>
           <w:tcPr>
-            <w:tcW w:w="3445" w:type="dxa"/>
+            <w:tcW w:w="3444" w:type="dxa"/>
             <w:tcBorders>
               <w:top w:val="single" w:sz="4" w:space="0" w:color="AAAAAA"/>
               <w:start w:val="single" w:sz="4" w:space="0" w:color="AAAAAA"/>
@@ -6022,7 +6081,7 @@
         </w:tc>
         <w:tc>
           <w:tcPr>
-            <w:tcW w:w="1090" w:type="dxa"/>
+            <w:tcW w:w="1091" w:type="dxa"/>
             <w:tcBorders>
               <w:top w:val="single" w:sz="4" w:space="0" w:color="AAAAAA"/>
               <w:start w:val="single" w:sz="4" w:space="0" w:color="AAAAAA"/>
@@ -6129,7 +6188,7 @@
         <w:trPr/>
         <w:tc>
           <w:tcPr>
-            <w:tcW w:w="3445" w:type="dxa"/>
+            <w:tcW w:w="3444" w:type="dxa"/>
             <w:tcBorders>
               <w:top w:val="single" w:sz="4" w:space="0" w:color="AAAAAA"/>
               <w:start w:val="single" w:sz="4" w:space="0" w:color="AAAAAA"/>
@@ -6155,7 +6214,7 @@
         </w:tc>
         <w:tc>
           <w:tcPr>
-            <w:tcW w:w="1090" w:type="dxa"/>
+            <w:tcW w:w="1091" w:type="dxa"/>
             <w:tcBorders>
               <w:top w:val="single" w:sz="4" w:space="0" w:color="AAAAAA"/>
               <w:start w:val="single" w:sz="4" w:space="0" w:color="AAAAAA"/>
@@ -6262,7 +6321,7 @@
         <w:trPr/>
         <w:tc>
           <w:tcPr>
-            <w:tcW w:w="3445" w:type="dxa"/>
+            <w:tcW w:w="3444" w:type="dxa"/>
             <w:tcBorders>
               <w:top w:val="single" w:sz="4" w:space="0" w:color="AAAAAA"/>
               <w:start w:val="single" w:sz="4" w:space="0" w:color="AAAAAA"/>
@@ -6288,7 +6347,7 @@
         </w:tc>
         <w:tc>
           <w:tcPr>
-            <w:tcW w:w="1090" w:type="dxa"/>
+            <w:tcW w:w="1091" w:type="dxa"/>
             <w:tcBorders>
               <w:top w:val="single" w:sz="4" w:space="0" w:color="AAAAAA"/>
               <w:start w:val="single" w:sz="4" w:space="0" w:color="AAAAAA"/>
@@ -6395,7 +6454,7 @@
         <w:trPr/>
         <w:tc>
           <w:tcPr>
-            <w:tcW w:w="3445" w:type="dxa"/>
+            <w:tcW w:w="3444" w:type="dxa"/>
             <w:tcBorders>
               <w:top w:val="single" w:sz="4" w:space="0" w:color="AAAAAA"/>
               <w:start w:val="single" w:sz="4" w:space="0" w:color="AAAAAA"/>
@@ -6421,7 +6480,7 @@
         </w:tc>
         <w:tc>
           <w:tcPr>
-            <w:tcW w:w="1090" w:type="dxa"/>
+            <w:tcW w:w="1091" w:type="dxa"/>
             <w:tcBorders>
               <w:top w:val="single" w:sz="4" w:space="0" w:color="AAAAAA"/>
               <w:start w:val="single" w:sz="4" w:space="0" w:color="AAAAAA"/>
@@ -6557,17 +6616,6 @@
           <w:sz w:val="20"/>
         </w:rPr>
         <w:t xml:space="preserve"> (véase Figuras A10 y A11 en Anexo para los diagnósticos de residuos del modelo OLS).</w:t>
-      </w:r>
-    </w:p>
-    <w:p>
-      <w:pPr>
-        <w:pStyle w:val="Normal"/>
-        <w:spacing w:lineRule="auto" w:line="360" w:before="0" w:after="160"/>
-        <w:jc w:val="both"/>
-        <w:rPr/>
-      </w:pPr>
-      <w:r>
-        <w:rPr/>
       </w:r>
     </w:p>
     <w:p>
@@ -6850,8 +6898,8 @@
         </w:tblCellMar>
       </w:tblPr>
       <w:tblGrid>
-        <w:gridCol w:w="3445"/>
-        <w:gridCol w:w="1090"/>
+        <w:gridCol w:w="3444"/>
+        <w:gridCol w:w="1091"/>
         <w:gridCol w:w="1814"/>
         <w:gridCol w:w="1814"/>
         <w:gridCol w:w="907"/>
@@ -6860,7 +6908,7 @@
         <w:trPr/>
         <w:tc>
           <w:tcPr>
-            <w:tcW w:w="3445" w:type="dxa"/>
+            <w:tcW w:w="3444" w:type="dxa"/>
             <w:tcBorders>
               <w:top w:val="single" w:sz="4" w:space="0" w:color="AAAAAA"/>
               <w:start w:val="single" w:sz="4" w:space="0" w:color="AAAAAA"/>
@@ -6890,7 +6938,7 @@
         </w:tc>
         <w:tc>
           <w:tcPr>
-            <w:tcW w:w="1090" w:type="dxa"/>
+            <w:tcW w:w="1091" w:type="dxa"/>
             <w:tcBorders>
               <w:top w:val="single" w:sz="4" w:space="0" w:color="AAAAAA"/>
               <w:start w:val="single" w:sz="4" w:space="0" w:color="AAAAAA"/>
@@ -7013,7 +7061,7 @@
         <w:trPr/>
         <w:tc>
           <w:tcPr>
-            <w:tcW w:w="3445" w:type="dxa"/>
+            <w:tcW w:w="3444" w:type="dxa"/>
             <w:tcBorders>
               <w:top w:val="single" w:sz="4" w:space="0" w:color="AAAAAA"/>
               <w:start w:val="single" w:sz="4" w:space="0" w:color="AAAAAA"/>
@@ -7039,7 +7087,7 @@
         </w:tc>
         <w:tc>
           <w:tcPr>
-            <w:tcW w:w="1090" w:type="dxa"/>
+            <w:tcW w:w="1091" w:type="dxa"/>
             <w:tcBorders>
               <w:top w:val="single" w:sz="4" w:space="0" w:color="AAAAAA"/>
               <w:start w:val="single" w:sz="4" w:space="0" w:color="AAAAAA"/>
@@ -7146,7 +7194,7 @@
         <w:trPr/>
         <w:tc>
           <w:tcPr>
-            <w:tcW w:w="3445" w:type="dxa"/>
+            <w:tcW w:w="3444" w:type="dxa"/>
             <w:tcBorders>
               <w:top w:val="single" w:sz="4" w:space="0" w:color="AAAAAA"/>
               <w:start w:val="single" w:sz="4" w:space="0" w:color="AAAAAA"/>
@@ -7172,7 +7220,7 @@
         </w:tc>
         <w:tc>
           <w:tcPr>
-            <w:tcW w:w="1090" w:type="dxa"/>
+            <w:tcW w:w="1091" w:type="dxa"/>
             <w:tcBorders>
               <w:top w:val="single" w:sz="4" w:space="0" w:color="AAAAAA"/>
               <w:start w:val="single" w:sz="4" w:space="0" w:color="AAAAAA"/>
@@ -7279,7 +7327,7 @@
         <w:trPr/>
         <w:tc>
           <w:tcPr>
-            <w:tcW w:w="3445" w:type="dxa"/>
+            <w:tcW w:w="3444" w:type="dxa"/>
             <w:tcBorders>
               <w:top w:val="single" w:sz="4" w:space="0" w:color="AAAAAA"/>
               <w:start w:val="single" w:sz="4" w:space="0" w:color="AAAAAA"/>
@@ -7305,7 +7353,7 @@
         </w:tc>
         <w:tc>
           <w:tcPr>
-            <w:tcW w:w="1090" w:type="dxa"/>
+            <w:tcW w:w="1091" w:type="dxa"/>
             <w:tcBorders>
               <w:top w:val="single" w:sz="4" w:space="0" w:color="AAAAAA"/>
               <w:start w:val="single" w:sz="4" w:space="0" w:color="AAAAAA"/>
@@ -7486,17 +7534,6 @@
     </w:p>
     <w:p>
       <w:pPr>
-        <w:pStyle w:val="Normal"/>
-        <w:spacing w:lineRule="auto" w:line="360" w:before="0" w:after="160"/>
-        <w:jc w:val="both"/>
-        <w:rPr/>
-      </w:pPr>
-      <w:r>
-        <w:rPr/>
-      </w:r>
-    </w:p>
-    <w:p>
-      <w:pPr>
         <w:pStyle w:val="Heading1"/>
         <w:pBdr>
           <w:bottom w:val="single" w:sz="6" w:space="0" w:color="1F497D"/>
@@ -7650,17 +7687,6 @@
           <w:szCs w:val="24"/>
         </w:rPr>
         <w:t>Las principales limitaciones del estudio son: (1) La base GRD no incluye estadiaje TNM, histología, ECOG performance status ni régimen de tratamiento específico; estas variables, si disponibles, explicarían parte del 36% de varianza residual de H₃. (2) La unidad de análisis es el egreso, no el paciente individual: un paciente hospitalizado múltiples veces contribuye múltiples registros, impidiendo análisis de trayectoria individual. (3) El IDH opera a nivel comunal (riesgo de falacia ecológica), no individual. (4) El diseño observacional limita la inferencia causal; los hallazgos son asociaciones ajustadas.</w:t>
-      </w:r>
-    </w:p>
-    <w:p>
-      <w:pPr>
-        <w:pStyle w:val="Normal"/>
-        <w:spacing w:lineRule="auto" w:line="360" w:before="0" w:after="160"/>
-        <w:jc w:val="both"/>
-        <w:rPr/>
-      </w:pPr>
-      <w:r>
-        <w:rPr/>
       </w:r>
     </w:p>
     <w:p>
@@ -7756,17 +7782,6 @@
     </w:p>
     <w:p>
       <w:pPr>
-        <w:pStyle w:val="Normal"/>
-        <w:spacing w:lineRule="auto" w:line="360" w:before="0" w:after="160"/>
-        <w:jc w:val="both"/>
-        <w:rPr/>
-      </w:pPr>
-      <w:r>
-        <w:rPr/>
-      </w:r>
-    </w:p>
-    <w:p>
-      <w:pPr>
         <w:pStyle w:val="Heading1"/>
         <w:pBdr>
           <w:bottom w:val="single" w:sz="6" w:space="0" w:color="1F497D"/>
@@ -8027,6 +8042,13 @@
       </w:r>
     </w:p>
     <w:p>
+      <w:pPr>
+        <w:pStyle w:val="Normal"/>
+        <w:rPr/>
+      </w:pPr>
+      <w:r>
+        <w:rPr/>
+      </w:r>
       <w:r>
         <w:br w:type="page"/>
       </w:r>
@@ -8034,11 +8056,12 @@
     <w:p>
       <w:pPr>
         <w:pStyle w:val="Heading1"/>
-        <w:jc w:val="left"/>
-      </w:pPr>
-      <w:r>
-        <w:rPr>
-          <w:rFonts w:ascii="Times New Roman" w:hAnsi="Times New Roman"/>
+        <w:spacing w:before="0" w:after="180"/>
+        <w:jc w:val="start"/>
+        <w:rPr/>
+      </w:pPr>
+      <w:r>
+        <w:rPr>
           <w:b/>
           <w:sz w:val="28"/>
         </w:rPr>
@@ -8047,11 +8070,12 @@
     </w:p>
     <w:p>
       <w:pPr>
-        <w:spacing w:after="240"/>
-      </w:pPr>
-      <w:r>
-        <w:rPr>
-          <w:rFonts w:ascii="Times New Roman" w:hAnsi="Times New Roman"/>
+        <w:pStyle w:val="Normal"/>
+        <w:spacing w:before="0" w:after="240"/>
+        <w:rPr/>
+      </w:pPr>
+      <w:r>
+        <w:rPr>
           <w:sz w:val="20"/>
         </w:rPr>
         <w:t>A continuación se presentan las figuras referenciadas en el texto principal del informe. La numeración sigue el formato Figura A1–A18, correspondiente al orden de aparición en el documento. Todas las figuras fueron generadas a partir del análisis del dataset GRD MINSAL/FONASA 2019–2024 utilizando Python (matplotlib, seaborn, scikit-learn, statsmodels).</w:t>
@@ -8059,23 +8083,526 @@
     </w:p>
     <w:p>
       <w:pPr>
+        <w:pStyle w:val="Normal"/>
         <w:spacing w:before="240" w:after="80"/>
         <w:jc w:val="center"/>
-      </w:pPr>
-      <w:r>
+        <w:rPr/>
+      </w:pPr>
+      <w:r>
+        <w:rPr/>
         <w:drawing>
-          <wp:inline xmlns:a="http://schemas.openxmlformats.org/drawingml/2006/main">
-            <wp:extent cx="5029200" cy="3560389"/>
+          <wp:inline distT="0" distB="0" distL="0" distR="0">
+            <wp:extent cx="5029200" cy="3560445"/>
+            <wp:effectExtent l="0" t="0" r="0" b="0"/>
             <wp:docPr id="1" name="Picture 1"/>
             <wp:cNvGraphicFramePr>
-              <a:graphicFrameLocks noChangeAspect="1"/>
+              <a:graphicFrameLocks xmlns:a="http://schemas.openxmlformats.org/drawingml/2006/main" noChangeAspect="1"/>
             </wp:cNvGraphicFramePr>
-            <a:graphic>
+            <a:graphic xmlns:a="http://schemas.openxmlformats.org/drawingml/2006/main">
               <a:graphicData uri="http://schemas.openxmlformats.org/drawingml/2006/picture">
-                <pic:pic>
+                <pic:pic xmlns:pic="http://schemas.openxmlformats.org/drawingml/2006/picture">
                   <pic:nvPicPr>
-                    <pic:cNvPr id="0" name="figura1_distribuciones_univariadas_C16.png"/>
-                    <pic:cNvPicPr/>
+                    <pic:cNvPr id="1" name="Picture 1"/>
+                    <pic:cNvPicPr>
+                      <a:picLocks noChangeAspect="1" noChangeArrowheads="1"/>
+                    </pic:cNvPicPr>
+                  </pic:nvPicPr>
+                  <pic:blipFill>
+                    <a:blip r:embed="rId2"/>
+                    <a:stretch>
+                      <a:fillRect/>
+                    </a:stretch>
+                  </pic:blipFill>
+                  <pic:spPr bwMode="auto">
+                    <a:xfrm>
+                      <a:off x="0" y="0"/>
+                      <a:ext cx="5029200" cy="3560445"/>
+                    </a:xfrm>
+                    <a:prstGeom prst="rect">
+                      <a:avLst/>
+                    </a:prstGeom>
+                    <a:noFill/>
+                  </pic:spPr>
+                </pic:pic>
+              </a:graphicData>
+            </a:graphic>
+          </wp:inline>
+        </w:drawing>
+      </w:r>
+    </w:p>
+    <w:p>
+      <w:pPr>
+        <w:pStyle w:val="Normal"/>
+        <w:spacing w:before="0" w:after="360"/>
+        <w:jc w:val="start"/>
+        <w:rPr/>
+      </w:pPr>
+      <w:r>
+        <w:rPr>
+          <w:b/>
+          <w:i/>
+          <w:sz w:val="20"/>
+        </w:rPr>
+        <w:t>Figura A1</w:t>
+      </w:r>
+      <w:r>
+        <w:rPr>
+          <w:sz w:val="20"/>
+        </w:rPr>
+        <w:t>. Distribuciones univariadas de las variables clave en pacientes con cáncer gástrico (C16.*). Los paneles muestran histogramas con curva de densidad para días de estadía, edad, cantidad de procedimientos, severidad GRD, peso GRD y comorbilidad. N = 17.096 egresos (2019–2024).</w:t>
+      </w:r>
+    </w:p>
+    <w:p>
+      <w:pPr>
+        <w:pStyle w:val="Normal"/>
+        <w:spacing w:before="240" w:after="80"/>
+        <w:jc w:val="center"/>
+        <w:rPr/>
+      </w:pPr>
+      <w:r>
+        <w:rPr/>
+        <w:drawing>
+          <wp:inline distT="0" distB="0" distL="0" distR="0">
+            <wp:extent cx="5029200" cy="4454525"/>
+            <wp:effectExtent l="0" t="0" r="0" b="0"/>
+            <wp:docPr id="2" name="Picture 2"/>
+            <wp:cNvGraphicFramePr>
+              <a:graphicFrameLocks xmlns:a="http://schemas.openxmlformats.org/drawingml/2006/main" noChangeAspect="1"/>
+            </wp:cNvGraphicFramePr>
+            <a:graphic xmlns:a="http://schemas.openxmlformats.org/drawingml/2006/main">
+              <a:graphicData uri="http://schemas.openxmlformats.org/drawingml/2006/picture">
+                <pic:pic xmlns:pic="http://schemas.openxmlformats.org/drawingml/2006/picture">
+                  <pic:nvPicPr>
+                    <pic:cNvPr id="2" name="Picture 2"/>
+                    <pic:cNvPicPr>
+                      <a:picLocks noChangeAspect="1" noChangeArrowheads="1"/>
+                    </pic:cNvPicPr>
+                  </pic:nvPicPr>
+                  <pic:blipFill>
+                    <a:blip r:embed="rId3"/>
+                    <a:stretch>
+                      <a:fillRect/>
+                    </a:stretch>
+                  </pic:blipFill>
+                  <pic:spPr bwMode="auto">
+                    <a:xfrm>
+                      <a:off x="0" y="0"/>
+                      <a:ext cx="5029200" cy="4454525"/>
+                    </a:xfrm>
+                    <a:prstGeom prst="rect">
+                      <a:avLst/>
+                    </a:prstGeom>
+                    <a:noFill/>
+                  </pic:spPr>
+                </pic:pic>
+              </a:graphicData>
+            </a:graphic>
+          </wp:inline>
+        </w:drawing>
+      </w:r>
+    </w:p>
+    <w:p>
+      <w:pPr>
+        <w:pStyle w:val="Normal"/>
+        <w:spacing w:before="0" w:after="360"/>
+        <w:jc w:val="start"/>
+        <w:rPr/>
+      </w:pPr>
+      <w:r>
+        <w:rPr>
+          <w:b/>
+          <w:i/>
+          <w:sz w:val="20"/>
+        </w:rPr>
+        <w:t>Figura A2</w:t>
+      </w:r>
+      <w:r>
+        <w:rPr>
+          <w:sz w:val="20"/>
+        </w:rPr>
+        <w:t>. Matriz de correlación de Pearson entre variables numéricas del subconjunto C16.*. Se destaca la correlación positiva entre procedimientos y días de estadía (r ≈ 0.55) y entre severidad GRD y días de estadía (r ≈ 0.48).</w:t>
+      </w:r>
+    </w:p>
+    <w:p>
+      <w:pPr>
+        <w:pStyle w:val="Normal"/>
+        <w:spacing w:before="240" w:after="80"/>
+        <w:jc w:val="center"/>
+        <w:rPr/>
+      </w:pPr>
+      <w:r>
+        <w:rPr/>
+        <w:drawing>
+          <wp:inline distT="0" distB="0" distL="0" distR="0">
+            <wp:extent cx="5029200" cy="2853055"/>
+            <wp:effectExtent l="0" t="0" r="0" b="0"/>
+            <wp:docPr id="3" name="Picture 3"/>
+            <wp:cNvGraphicFramePr>
+              <a:graphicFrameLocks xmlns:a="http://schemas.openxmlformats.org/drawingml/2006/main" noChangeAspect="1"/>
+            </wp:cNvGraphicFramePr>
+            <a:graphic xmlns:a="http://schemas.openxmlformats.org/drawingml/2006/main">
+              <a:graphicData uri="http://schemas.openxmlformats.org/drawingml/2006/picture">
+                <pic:pic xmlns:pic="http://schemas.openxmlformats.org/drawingml/2006/picture">
+                  <pic:nvPicPr>
+                    <pic:cNvPr id="3" name="Picture 3"/>
+                    <pic:cNvPicPr>
+                      <a:picLocks noChangeAspect="1" noChangeArrowheads="1"/>
+                    </pic:cNvPicPr>
+                  </pic:nvPicPr>
+                  <pic:blipFill>
+                    <a:blip r:embed="rId4"/>
+                    <a:stretch>
+                      <a:fillRect/>
+                    </a:stretch>
+                  </pic:blipFill>
+                  <pic:spPr bwMode="auto">
+                    <a:xfrm>
+                      <a:off x="0" y="0"/>
+                      <a:ext cx="5029200" cy="2853055"/>
+                    </a:xfrm>
+                    <a:prstGeom prst="rect">
+                      <a:avLst/>
+                    </a:prstGeom>
+                    <a:noFill/>
+                  </pic:spPr>
+                </pic:pic>
+              </a:graphicData>
+            </a:graphic>
+          </wp:inline>
+        </w:drawing>
+      </w:r>
+    </w:p>
+    <w:p>
+      <w:pPr>
+        <w:pStyle w:val="Normal"/>
+        <w:spacing w:before="0" w:after="360"/>
+        <w:jc w:val="start"/>
+        <w:rPr/>
+      </w:pPr>
+      <w:r>
+        <w:rPr>
+          <w:b/>
+          <w:i/>
+          <w:sz w:val="20"/>
+        </w:rPr>
+        <w:t>Figura A3</w:t>
+      </w:r>
+      <w:r>
+        <w:rPr>
+          <w:sz w:val="20"/>
+        </w:rPr>
+        <w:t>. Distribución de días de estadía por hospital para pacientes con cáncer gástrico (C16.*). La mediana varía de 0 a más de 9 días entre establecimientos, evidenciando la variabilidad institucional que motiva el estudio. Top 25 hospitales por volumen de egresos.</w:t>
+      </w:r>
+    </w:p>
+    <w:p>
+      <w:pPr>
+        <w:pStyle w:val="Normal"/>
+        <w:spacing w:before="240" w:after="80"/>
+        <w:jc w:val="center"/>
+        <w:rPr/>
+      </w:pPr>
+      <w:r>
+        <w:rPr/>
+        <w:drawing>
+          <wp:inline distT="0" distB="0" distL="0" distR="0">
+            <wp:extent cx="5029200" cy="3341370"/>
+            <wp:effectExtent l="0" t="0" r="0" b="0"/>
+            <wp:docPr id="4" name="Picture 4"/>
+            <wp:cNvGraphicFramePr>
+              <a:graphicFrameLocks xmlns:a="http://schemas.openxmlformats.org/drawingml/2006/main" noChangeAspect="1"/>
+            </wp:cNvGraphicFramePr>
+            <a:graphic xmlns:a="http://schemas.openxmlformats.org/drawingml/2006/main">
+              <a:graphicData uri="http://schemas.openxmlformats.org/drawingml/2006/picture">
+                <pic:pic xmlns:pic="http://schemas.openxmlformats.org/drawingml/2006/picture">
+                  <pic:nvPicPr>
+                    <pic:cNvPr id="4" name="Picture 4"/>
+                    <pic:cNvPicPr>
+                      <a:picLocks noChangeAspect="1" noChangeArrowheads="1"/>
+                    </pic:cNvPicPr>
+                  </pic:nvPicPr>
+                  <pic:blipFill>
+                    <a:blip r:embed="rId5"/>
+                    <a:stretch>
+                      <a:fillRect/>
+                    </a:stretch>
+                  </pic:blipFill>
+                  <pic:spPr bwMode="auto">
+                    <a:xfrm>
+                      <a:off x="0" y="0"/>
+                      <a:ext cx="5029200" cy="3341370"/>
+                    </a:xfrm>
+                    <a:prstGeom prst="rect">
+                      <a:avLst/>
+                    </a:prstGeom>
+                    <a:noFill/>
+                  </pic:spPr>
+                </pic:pic>
+              </a:graphicData>
+            </a:graphic>
+          </wp:inline>
+        </w:drawing>
+      </w:r>
+    </w:p>
+    <w:p>
+      <w:pPr>
+        <w:pStyle w:val="Normal"/>
+        <w:spacing w:before="0" w:after="360"/>
+        <w:jc w:val="start"/>
+        <w:rPr/>
+      </w:pPr>
+      <w:r>
+        <w:rPr>
+          <w:b/>
+          <w:i/>
+          <w:sz w:val="20"/>
+        </w:rPr>
+        <w:t>Figura A4</w:t>
+      </w:r>
+      <w:r>
+        <w:rPr>
+          <w:sz w:val="20"/>
+        </w:rPr>
+        <w:t>. Tasa de mortalidad intrahospitalaria por hospital en pacientes con cáncer gástrico (C16.*). La diferencia entre hospitales alcanza hasta 12 puntos porcentuales. Barras de error representan intervalos de confianza al 95%.</w:t>
+      </w:r>
+    </w:p>
+    <w:p>
+      <w:pPr>
+        <w:pStyle w:val="Normal"/>
+        <w:spacing w:before="240" w:after="80"/>
+        <w:jc w:val="center"/>
+        <w:rPr/>
+      </w:pPr>
+      <w:r>
+        <w:rPr/>
+        <w:drawing>
+          <wp:inline distT="0" distB="0" distL="0" distR="0">
+            <wp:extent cx="5029200" cy="3344545"/>
+            <wp:effectExtent l="0" t="0" r="0" b="0"/>
+            <wp:docPr id="5" name="Picture 5"/>
+            <wp:cNvGraphicFramePr>
+              <a:graphicFrameLocks xmlns:a="http://schemas.openxmlformats.org/drawingml/2006/main" noChangeAspect="1"/>
+            </wp:cNvGraphicFramePr>
+            <a:graphic xmlns:a="http://schemas.openxmlformats.org/drawingml/2006/main">
+              <a:graphicData uri="http://schemas.openxmlformats.org/drawingml/2006/picture">
+                <pic:pic xmlns:pic="http://schemas.openxmlformats.org/drawingml/2006/picture">
+                  <pic:nvPicPr>
+                    <pic:cNvPr id="5" name="Picture 5"/>
+                    <pic:cNvPicPr>
+                      <a:picLocks noChangeAspect="1" noChangeArrowheads="1"/>
+                    </pic:cNvPicPr>
+                  </pic:nvPicPr>
+                  <pic:blipFill>
+                    <a:blip r:embed="rId6"/>
+                    <a:stretch>
+                      <a:fillRect/>
+                    </a:stretch>
+                  </pic:blipFill>
+                  <pic:spPr bwMode="auto">
+                    <a:xfrm>
+                      <a:off x="0" y="0"/>
+                      <a:ext cx="5029200" cy="3344545"/>
+                    </a:xfrm>
+                    <a:prstGeom prst="rect">
+                      <a:avLst/>
+                    </a:prstGeom>
+                    <a:noFill/>
+                  </pic:spPr>
+                </pic:pic>
+              </a:graphicData>
+            </a:graphic>
+          </wp:inline>
+        </w:drawing>
+      </w:r>
+    </w:p>
+    <w:p>
+      <w:pPr>
+        <w:pStyle w:val="Normal"/>
+        <w:spacing w:before="0" w:after="360"/>
+        <w:jc w:val="start"/>
+        <w:rPr/>
+      </w:pPr>
+      <w:r>
+        <w:rPr>
+          <w:b/>
+          <w:i/>
+          <w:sz w:val="20"/>
+        </w:rPr>
+        <w:t>Figura A5</w:t>
+      </w:r>
+      <w:r>
+        <w:rPr>
+          <w:sz w:val="20"/>
+        </w:rPr>
+        <w:t>. Promedio de procedimientos realizados por hospital en pacientes con cáncer gástrico (C16.*). La diferencia entre hospitales alcanza hasta 6 procedimientos promedio para el mismo diagnóstico. Barras de error representan intervalos de confianza al 95%.</w:t>
+      </w:r>
+    </w:p>
+    <w:p>
+      <w:pPr>
+        <w:pStyle w:val="Normal"/>
+        <w:spacing w:before="240" w:after="80"/>
+        <w:jc w:val="center"/>
+        <w:rPr/>
+      </w:pPr>
+      <w:r>
+        <w:rPr/>
+        <w:drawing>
+          <wp:inline distT="0" distB="0" distL="0" distR="0">
+            <wp:extent cx="5029200" cy="2230120"/>
+            <wp:effectExtent l="0" t="0" r="0" b="0"/>
+            <wp:docPr id="6" name="Picture 6"/>
+            <wp:cNvGraphicFramePr>
+              <a:graphicFrameLocks xmlns:a="http://schemas.openxmlformats.org/drawingml/2006/main" noChangeAspect="1"/>
+            </wp:cNvGraphicFramePr>
+            <a:graphic xmlns:a="http://schemas.openxmlformats.org/drawingml/2006/main">
+              <a:graphicData uri="http://schemas.openxmlformats.org/drawingml/2006/picture">
+                <pic:pic xmlns:pic="http://schemas.openxmlformats.org/drawingml/2006/picture">
+                  <pic:nvPicPr>
+                    <pic:cNvPr id="6" name="Picture 6"/>
+                    <pic:cNvPicPr>
+                      <a:picLocks noChangeAspect="1" noChangeArrowheads="1"/>
+                    </pic:cNvPicPr>
+                  </pic:nvPicPr>
+                  <pic:blipFill>
+                    <a:blip r:embed="rId7"/>
+                    <a:stretch>
+                      <a:fillRect/>
+                    </a:stretch>
+                  </pic:blipFill>
+                  <pic:spPr bwMode="auto">
+                    <a:xfrm>
+                      <a:off x="0" y="0"/>
+                      <a:ext cx="5029200" cy="2230120"/>
+                    </a:xfrm>
+                    <a:prstGeom prst="rect">
+                      <a:avLst/>
+                    </a:prstGeom>
+                    <a:noFill/>
+                  </pic:spPr>
+                </pic:pic>
+              </a:graphicData>
+            </a:graphic>
+          </wp:inline>
+        </w:drawing>
+      </w:r>
+    </w:p>
+    <w:p>
+      <w:pPr>
+        <w:pStyle w:val="Normal"/>
+        <w:spacing w:before="0" w:after="360"/>
+        <w:jc w:val="start"/>
+        <w:rPr/>
+      </w:pPr>
+      <w:r>
+        <w:rPr>
+          <w:b/>
+          <w:i/>
+          <w:sz w:val="20"/>
+        </w:rPr>
+        <w:t>Figura A6</w:t>
+      </w:r>
+      <w:r>
+        <w:rPr>
+          <w:sz w:val="20"/>
+        </w:rPr>
+        <w:t>. Distribución de egresos por tipo de ingreso y sexo en cáncer gástrico (C16.*). Los hombres representan aproximadamente el 60% de los ingresos. Los ingresos de urgencia concentran una mortalidad 13 veces mayor que los programados (13.9% vs. 1.1%).</w:t>
+      </w:r>
+    </w:p>
+    <w:p>
+      <w:pPr>
+        <w:pStyle w:val="Normal"/>
+        <w:spacing w:before="240" w:after="80"/>
+        <w:jc w:val="center"/>
+        <w:rPr/>
+      </w:pPr>
+      <w:r>
+        <w:rPr/>
+        <w:drawing>
+          <wp:inline distT="0" distB="0" distL="0" distR="0">
+            <wp:extent cx="5029200" cy="4697095"/>
+            <wp:effectExtent l="0" t="0" r="0" b="0"/>
+            <wp:docPr id="7" name="Picture 7"/>
+            <wp:cNvGraphicFramePr>
+              <a:graphicFrameLocks xmlns:a="http://schemas.openxmlformats.org/drawingml/2006/main" noChangeAspect="1"/>
+            </wp:cNvGraphicFramePr>
+            <a:graphic xmlns:a="http://schemas.openxmlformats.org/drawingml/2006/main">
+              <a:graphicData uri="http://schemas.openxmlformats.org/drawingml/2006/picture">
+                <pic:pic xmlns:pic="http://schemas.openxmlformats.org/drawingml/2006/picture">
+                  <pic:nvPicPr>
+                    <pic:cNvPr id="7" name="Picture 7"/>
+                    <pic:cNvPicPr>
+                      <a:picLocks noChangeAspect="1" noChangeArrowheads="1"/>
+                    </pic:cNvPicPr>
+                  </pic:nvPicPr>
+                  <pic:blipFill>
+                    <a:blip r:embed="rId8"/>
+                    <a:stretch>
+                      <a:fillRect/>
+                    </a:stretch>
+                  </pic:blipFill>
+                  <pic:spPr bwMode="auto">
+                    <a:xfrm>
+                      <a:off x="0" y="0"/>
+                      <a:ext cx="5029200" cy="4697095"/>
+                    </a:xfrm>
+                    <a:prstGeom prst="rect">
+                      <a:avLst/>
+                    </a:prstGeom>
+                    <a:noFill/>
+                  </pic:spPr>
+                </pic:pic>
+              </a:graphicData>
+            </a:graphic>
+          </wp:inline>
+        </w:drawing>
+      </w:r>
+    </w:p>
+    <w:p>
+      <w:pPr>
+        <w:pStyle w:val="Normal"/>
+        <w:spacing w:before="0" w:after="360"/>
+        <w:jc w:val="start"/>
+        <w:rPr/>
+      </w:pPr>
+      <w:r>
+        <w:rPr>
+          <w:b/>
+          <w:i/>
+          <w:sz w:val="20"/>
+        </w:rPr>
+        <w:t>Figura A7</w:t>
+      </w:r>
+      <w:r>
+        <w:rPr>
+          <w:sz w:val="20"/>
+        </w:rPr>
+        <w:t>. Heatmap de p-valores ajustados del test post-hoc Dunn-Bonferroni para cantidad de procedimientos entre pares de hospitales (H₁). Celdas oscuras indican pares con diferencias estadísticamente significativas (p &lt; 0.05). El 61.8% de los pares muestran diferencias significativas.</w:t>
+      </w:r>
+    </w:p>
+    <w:p>
+      <w:pPr>
+        <w:pStyle w:val="Normal"/>
+        <w:spacing w:before="240" w:after="80"/>
+        <w:jc w:val="center"/>
+        <w:rPr/>
+      </w:pPr>
+      <w:r>
+        <w:rPr/>
+        <w:drawing>
+          <wp:inline distT="0" distB="0" distL="0" distR="0">
+            <wp:extent cx="5029200" cy="5012055"/>
+            <wp:effectExtent l="0" t="0" r="0" b="0"/>
+            <wp:docPr id="8" name="Picture 8"/>
+            <wp:cNvGraphicFramePr>
+              <a:graphicFrameLocks xmlns:a="http://schemas.openxmlformats.org/drawingml/2006/main" noChangeAspect="1"/>
+            </wp:cNvGraphicFramePr>
+            <a:graphic xmlns:a="http://schemas.openxmlformats.org/drawingml/2006/main">
+              <a:graphicData uri="http://schemas.openxmlformats.org/drawingml/2006/picture">
+                <pic:pic xmlns:pic="http://schemas.openxmlformats.org/drawingml/2006/picture">
+                  <pic:nvPicPr>
+                    <pic:cNvPr id="8" name="Picture 8"/>
+                    <pic:cNvPicPr>
+                      <a:picLocks noChangeAspect="1" noChangeArrowheads="1"/>
+                    </pic:cNvPicPr>
                   </pic:nvPicPr>
                   <pic:blipFill>
                     <a:blip r:embed="rId9"/>
@@ -8083,12 +8610,15 @@
                       <a:fillRect/>
                     </a:stretch>
                   </pic:blipFill>
-                  <pic:spPr>
+                  <pic:spPr bwMode="auto">
                     <a:xfrm>
                       <a:off x="0" y="0"/>
-                      <a:ext cx="5029200" cy="3560389"/>
+                      <a:ext cx="5029200" cy="5012055"/>
                     </a:xfrm>
-                    <a:prstGeom prst="rect"/>
+                    <a:prstGeom prst="rect">
+                      <a:avLst/>
+                    </a:prstGeom>
+                    <a:noFill/>
                   </pic:spPr>
                 </pic:pic>
               </a:graphicData>
@@ -8099,52 +8629,51 @@
     </w:p>
     <w:p>
       <w:pPr>
-        <w:spacing w:after="360"/>
-        <w:jc w:val="left"/>
-      </w:pPr>
-      <w:r>
-        <w:rPr>
-          <w:rFonts w:ascii="Times New Roman" w:hAnsi="Times New Roman"/>
+        <w:pStyle w:val="Normal"/>
+        <w:spacing w:before="0" w:after="360"/>
+        <w:jc w:val="start"/>
+        <w:rPr/>
+      </w:pPr>
+      <w:r>
+        <w:rPr>
           <w:b/>
           <w:i/>
           <w:sz w:val="20"/>
         </w:rPr>
-        <w:t>Figura A1</w:t>
-      </w:r>
-      <w:r>
-        <w:rPr>
-          <w:rFonts w:ascii="Times New Roman" w:hAnsi="Times New Roman"/>
+        <w:t>Figura A8</w:t>
+      </w:r>
+      <w:r>
+        <w:rPr>
           <w:sz w:val="20"/>
         </w:rPr>
-        <w:t xml:space="preserve">. </w:t>
-      </w:r>
-      <w:r>
-        <w:rPr>
-          <w:rFonts w:ascii="Times New Roman" w:hAnsi="Times New Roman"/>
-          <w:sz w:val="20"/>
-        </w:rPr>
-        <w:t>Distribuciones univariadas de las variables clave en pacientes con cáncer gástrico (C16.*). Los paneles muestran histogramas con curva de densidad para días de estadía, edad, cantidad de procedimientos, severidad GRD, peso GRD y comorbilidad. N = 17.096 egresos (2019–2024).</w:t>
-      </w:r>
-    </w:p>
-    <w:p>
-      <w:pPr>
+        <w:t>. Curva ROC del modelo de regresión logística para mortalidad intrahospitalaria (H₂). AUC = 0.823, indicando capacidad discriminativa buena. Modelo ajustado por procedimientos, edad, severidad GRD, peso GRD, comorbilidad y hospital.</w:t>
+      </w:r>
+    </w:p>
+    <w:p>
+      <w:pPr>
+        <w:pStyle w:val="Normal"/>
         <w:spacing w:before="240" w:after="80"/>
         <w:jc w:val="center"/>
-      </w:pPr>
-      <w:r>
+        <w:rPr/>
+      </w:pPr>
+      <w:r>
+        <w:rPr/>
         <w:drawing>
-          <wp:inline xmlns:a="http://schemas.openxmlformats.org/drawingml/2006/main">
-            <wp:extent cx="5029200" cy="4454703"/>
-            <wp:docPr id="2" name="Picture 2"/>
+          <wp:inline distT="0" distB="0" distL="0" distR="0">
+            <wp:extent cx="5029200" cy="3523615"/>
+            <wp:effectExtent l="0" t="0" r="0" b="0"/>
+            <wp:docPr id="9" name="Picture 9"/>
             <wp:cNvGraphicFramePr>
-              <a:graphicFrameLocks noChangeAspect="1"/>
+              <a:graphicFrameLocks xmlns:a="http://schemas.openxmlformats.org/drawingml/2006/main" noChangeAspect="1"/>
             </wp:cNvGraphicFramePr>
-            <a:graphic>
+            <a:graphic xmlns:a="http://schemas.openxmlformats.org/drawingml/2006/main">
               <a:graphicData uri="http://schemas.openxmlformats.org/drawingml/2006/picture">
-                <pic:pic>
+                <pic:pic xmlns:pic="http://schemas.openxmlformats.org/drawingml/2006/picture">
                   <pic:nvPicPr>
-                    <pic:cNvPr id="0" name="figura2_matriz_correlacion_C16.png"/>
-                    <pic:cNvPicPr/>
+                    <pic:cNvPr id="9" name="Picture 9"/>
+                    <pic:cNvPicPr>
+                      <a:picLocks noChangeAspect="1" noChangeArrowheads="1"/>
+                    </pic:cNvPicPr>
                   </pic:nvPicPr>
                   <pic:blipFill>
                     <a:blip r:embed="rId10"/>
@@ -8152,12 +8681,15 @@
                       <a:fillRect/>
                     </a:stretch>
                   </pic:blipFill>
-                  <pic:spPr>
+                  <pic:spPr bwMode="auto">
                     <a:xfrm>
                       <a:off x="0" y="0"/>
-                      <a:ext cx="5029200" cy="4454703"/>
+                      <a:ext cx="5029200" cy="3523615"/>
                     </a:xfrm>
-                    <a:prstGeom prst="rect"/>
+                    <a:prstGeom prst="rect">
+                      <a:avLst/>
+                    </a:prstGeom>
+                    <a:noFill/>
                   </pic:spPr>
                 </pic:pic>
               </a:graphicData>
@@ -8168,52 +8700,51 @@
     </w:p>
     <w:p>
       <w:pPr>
-        <w:spacing w:after="360"/>
-        <w:jc w:val="left"/>
-      </w:pPr>
-      <w:r>
-        <w:rPr>
-          <w:rFonts w:ascii="Times New Roman" w:hAnsi="Times New Roman"/>
+        <w:pStyle w:val="Normal"/>
+        <w:spacing w:before="0" w:after="360"/>
+        <w:jc w:val="start"/>
+        <w:rPr/>
+      </w:pPr>
+      <w:r>
+        <w:rPr>
           <w:b/>
           <w:i/>
           <w:sz w:val="20"/>
         </w:rPr>
-        <w:t>Figura A2</w:t>
-      </w:r>
-      <w:r>
-        <w:rPr>
-          <w:rFonts w:ascii="Times New Roman" w:hAnsi="Times New Roman"/>
+        <w:t>Figura A9</w:t>
+      </w:r>
+      <w:r>
+        <w:rPr>
           <w:sz w:val="20"/>
         </w:rPr>
-        <w:t xml:space="preserve">. </w:t>
-      </w:r>
-      <w:r>
-        <w:rPr>
-          <w:rFonts w:ascii="Times New Roman" w:hAnsi="Times New Roman"/>
-          <w:sz w:val="20"/>
-        </w:rPr>
-        <w:t>Matriz de correlación de Pearson entre variables numéricas del subconjunto C16.*. Se destaca la correlación positiva entre procedimientos y días de estadía (r ≈ 0.55) y entre severidad GRD y días de estadía (r ≈ 0.48).</w:t>
-      </w:r>
-    </w:p>
-    <w:p>
-      <w:pPr>
+        <w:t>. Forest plot de odds ratios ajustados del modelo de regresión logística para mortalidad intrahospitalaria (H₂). La severidad GRD es el predictor dominante (OR = 6.12). Los intervalos de confianza son al 95%.</w:t>
+      </w:r>
+    </w:p>
+    <w:p>
+      <w:pPr>
+        <w:pStyle w:val="Normal"/>
         <w:spacing w:before="240" w:after="80"/>
         <w:jc w:val="center"/>
-      </w:pPr>
-      <w:r>
+        <w:rPr/>
+      </w:pPr>
+      <w:r>
+        <w:rPr/>
         <w:drawing>
-          <wp:inline xmlns:a="http://schemas.openxmlformats.org/drawingml/2006/main">
-            <wp:extent cx="5029200" cy="2853301"/>
-            <wp:docPr id="3" name="Picture 3"/>
+          <wp:inline distT="0" distB="0" distL="0" distR="0">
+            <wp:extent cx="5029200" cy="5029200"/>
+            <wp:effectExtent l="0" t="0" r="0" b="0"/>
+            <wp:docPr id="10" name="Picture 10"/>
             <wp:cNvGraphicFramePr>
-              <a:graphicFrameLocks noChangeAspect="1"/>
+              <a:graphicFrameLocks xmlns:a="http://schemas.openxmlformats.org/drawingml/2006/main" noChangeAspect="1"/>
             </wp:cNvGraphicFramePr>
-            <a:graphic>
+            <a:graphic xmlns:a="http://schemas.openxmlformats.org/drawingml/2006/main">
               <a:graphicData uri="http://schemas.openxmlformats.org/drawingml/2006/picture">
-                <pic:pic>
+                <pic:pic xmlns:pic="http://schemas.openxmlformats.org/drawingml/2006/picture">
                   <pic:nvPicPr>
-                    <pic:cNvPr id="0" name="figura3_boxplot_dias_hospital_C16.png"/>
-                    <pic:cNvPicPr/>
+                    <pic:cNvPr id="10" name="Picture 10"/>
+                    <pic:cNvPicPr>
+                      <a:picLocks noChangeAspect="1" noChangeArrowheads="1"/>
+                    </pic:cNvPicPr>
                   </pic:nvPicPr>
                   <pic:blipFill>
                     <a:blip r:embed="rId11"/>
@@ -8221,12 +8752,15 @@
                       <a:fillRect/>
                     </a:stretch>
                   </pic:blipFill>
-                  <pic:spPr>
+                  <pic:spPr bwMode="auto">
                     <a:xfrm>
                       <a:off x="0" y="0"/>
-                      <a:ext cx="5029200" cy="2853301"/>
+                      <a:ext cx="5029200" cy="5029200"/>
                     </a:xfrm>
-                    <a:prstGeom prst="rect"/>
+                    <a:prstGeom prst="rect">
+                      <a:avLst/>
+                    </a:prstGeom>
+                    <a:noFill/>
                   </pic:spPr>
                 </pic:pic>
               </a:graphicData>
@@ -8237,52 +8771,51 @@
     </w:p>
     <w:p>
       <w:pPr>
-        <w:spacing w:after="360"/>
-        <w:jc w:val="left"/>
-      </w:pPr>
-      <w:r>
-        <w:rPr>
-          <w:rFonts w:ascii="Times New Roman" w:hAnsi="Times New Roman"/>
+        <w:pStyle w:val="Normal"/>
+        <w:spacing w:before="0" w:after="360"/>
+        <w:jc w:val="start"/>
+        <w:rPr/>
+      </w:pPr>
+      <w:r>
+        <w:rPr>
           <w:b/>
           <w:i/>
           <w:sz w:val="20"/>
         </w:rPr>
-        <w:t>Figura A3</w:t>
-      </w:r>
-      <w:r>
-        <w:rPr>
-          <w:rFonts w:ascii="Times New Roman" w:hAnsi="Times New Roman"/>
+        <w:t>Figura A10</w:t>
+      </w:r>
+      <w:r>
+        <w:rPr>
           <w:sz w:val="20"/>
         </w:rPr>
-        <w:t xml:space="preserve">. </w:t>
-      </w:r>
-      <w:r>
-        <w:rPr>
-          <w:rFonts w:ascii="Times New Roman" w:hAnsi="Times New Roman"/>
-          <w:sz w:val="20"/>
-        </w:rPr>
-        <w:t>Distribución de días de estadía por hospital para pacientes con cáncer gástrico (C16.*). La mediana varía de 0 a más de 9 días entre establecimientos, evidenciando la variabilidad institucional que motiva el estudio. Top 25 hospitales por volumen de egresos.</w:t>
-      </w:r>
-    </w:p>
-    <w:p>
-      <w:pPr>
+        <w:t>. Valores predichos versus observados del modelo OLS para log(1 + días de estadía) (H₃). R² = 0.636. Errores estándar robustos HC3. La línea de 45° indica predicción perfecta.</w:t>
+      </w:r>
+    </w:p>
+    <w:p>
+      <w:pPr>
+        <w:pStyle w:val="Normal"/>
         <w:spacing w:before="240" w:after="80"/>
         <w:jc w:val="center"/>
-      </w:pPr>
-      <w:r>
+        <w:rPr/>
+      </w:pPr>
+      <w:r>
+        <w:rPr/>
         <w:drawing>
-          <wp:inline xmlns:a="http://schemas.openxmlformats.org/drawingml/2006/main">
-            <wp:extent cx="5029200" cy="3341018"/>
-            <wp:docPr id="4" name="Picture 4"/>
+          <wp:inline distT="0" distB="0" distL="0" distR="0">
+            <wp:extent cx="5029200" cy="4449445"/>
+            <wp:effectExtent l="0" t="0" r="0" b="0"/>
+            <wp:docPr id="11" name="Picture 11"/>
             <wp:cNvGraphicFramePr>
-              <a:graphicFrameLocks noChangeAspect="1"/>
+              <a:graphicFrameLocks xmlns:a="http://schemas.openxmlformats.org/drawingml/2006/main" noChangeAspect="1"/>
             </wp:cNvGraphicFramePr>
-            <a:graphic>
+            <a:graphic xmlns:a="http://schemas.openxmlformats.org/drawingml/2006/main">
               <a:graphicData uri="http://schemas.openxmlformats.org/drawingml/2006/picture">
-                <pic:pic>
+                <pic:pic xmlns:pic="http://schemas.openxmlformats.org/drawingml/2006/picture">
                   <pic:nvPicPr>
-                    <pic:cNvPr id="0" name="figura4_barplot_mortalidad_hospital_C16.png"/>
-                    <pic:cNvPicPr/>
+                    <pic:cNvPr id="11" name="Picture 11"/>
+                    <pic:cNvPicPr>
+                      <a:picLocks noChangeAspect="1" noChangeArrowheads="1"/>
+                    </pic:cNvPicPr>
                   </pic:nvPicPr>
                   <pic:blipFill>
                     <a:blip r:embed="rId12"/>
@@ -8290,12 +8823,15 @@
                       <a:fillRect/>
                     </a:stretch>
                   </pic:blipFill>
-                  <pic:spPr>
+                  <pic:spPr bwMode="auto">
                     <a:xfrm>
                       <a:off x="0" y="0"/>
-                      <a:ext cx="5029200" cy="3341018"/>
+                      <a:ext cx="5029200" cy="4449445"/>
                     </a:xfrm>
-                    <a:prstGeom prst="rect"/>
+                    <a:prstGeom prst="rect">
+                      <a:avLst/>
+                    </a:prstGeom>
+                    <a:noFill/>
                   </pic:spPr>
                 </pic:pic>
               </a:graphicData>
@@ -8306,52 +8842,51 @@
     </w:p>
     <w:p>
       <w:pPr>
-        <w:spacing w:after="360"/>
-        <w:jc w:val="left"/>
-      </w:pPr>
-      <w:r>
-        <w:rPr>
-          <w:rFonts w:ascii="Times New Roman" w:hAnsi="Times New Roman"/>
+        <w:pStyle w:val="Normal"/>
+        <w:spacing w:before="0" w:after="360"/>
+        <w:jc w:val="start"/>
+        <w:rPr/>
+      </w:pPr>
+      <w:r>
+        <w:rPr>
           <w:b/>
           <w:i/>
           <w:sz w:val="20"/>
         </w:rPr>
-        <w:t>Figura A4</w:t>
-      </w:r>
-      <w:r>
-        <w:rPr>
-          <w:rFonts w:ascii="Times New Roman" w:hAnsi="Times New Roman"/>
+        <w:t>Figura A11</w:t>
+      </w:r>
+      <w:r>
+        <w:rPr>
           <w:sz w:val="20"/>
         </w:rPr>
-        <w:t xml:space="preserve">. </w:t>
-      </w:r>
-      <w:r>
-        <w:rPr>
-          <w:rFonts w:ascii="Times New Roman" w:hAnsi="Times New Roman"/>
-          <w:sz w:val="20"/>
-        </w:rPr>
-        <w:t>Tasa de mortalidad intrahospitalaria por hospital en pacientes con cáncer gástrico (C16.*). La diferencia entre hospitales alcanza hasta 12 puntos porcentuales. Barras de error representan intervalos de confianza al 95%.</w:t>
-      </w:r>
-    </w:p>
-    <w:p>
-      <w:pPr>
+        <w:t>. Panel de diagnóstico de residuos del modelo OLS (H₃). Incluye: residuos vs. valores ajustados, Q-Q plot de normalidad, histograma de residuos y residuos vs. leverage. Los patrones son consistentes con un ajuste razonable del modelo.</w:t>
+      </w:r>
+    </w:p>
+    <w:p>
+      <w:pPr>
+        <w:pStyle w:val="Normal"/>
         <w:spacing w:before="240" w:after="80"/>
         <w:jc w:val="center"/>
-      </w:pPr>
-      <w:r>
+        <w:rPr/>
+      </w:pPr>
+      <w:r>
+        <w:rPr/>
         <w:drawing>
-          <wp:inline xmlns:a="http://schemas.openxmlformats.org/drawingml/2006/main">
-            <wp:extent cx="5029200" cy="3344772"/>
-            <wp:docPr id="5" name="Picture 5"/>
+          <wp:inline distT="0" distB="0" distL="0" distR="0">
+            <wp:extent cx="5029200" cy="3376295"/>
+            <wp:effectExtent l="0" t="0" r="0" b="0"/>
+            <wp:docPr id="12" name="Picture 12"/>
             <wp:cNvGraphicFramePr>
-              <a:graphicFrameLocks noChangeAspect="1"/>
+              <a:graphicFrameLocks xmlns:a="http://schemas.openxmlformats.org/drawingml/2006/main" noChangeAspect="1"/>
             </wp:cNvGraphicFramePr>
-            <a:graphic>
+            <a:graphic xmlns:a="http://schemas.openxmlformats.org/drawingml/2006/main">
               <a:graphicData uri="http://schemas.openxmlformats.org/drawingml/2006/picture">
-                <pic:pic>
+                <pic:pic xmlns:pic="http://schemas.openxmlformats.org/drawingml/2006/picture">
                   <pic:nvPicPr>
-                    <pic:cNvPr id="0" name="figura5_barplot_procedimientos_hospital_C16.png"/>
-                    <pic:cNvPicPr/>
+                    <pic:cNvPr id="12" name="Picture 12"/>
+                    <pic:cNvPicPr>
+                      <a:picLocks noChangeAspect="1" noChangeArrowheads="1"/>
+                    </pic:cNvPicPr>
                   </pic:nvPicPr>
                   <pic:blipFill>
                     <a:blip r:embed="rId13"/>
@@ -8359,12 +8894,15 @@
                       <a:fillRect/>
                     </a:stretch>
                   </pic:blipFill>
-                  <pic:spPr>
+                  <pic:spPr bwMode="auto">
                     <a:xfrm>
                       <a:off x="0" y="0"/>
-                      <a:ext cx="5029200" cy="3344772"/>
+                      <a:ext cx="5029200" cy="3376295"/>
                     </a:xfrm>
-                    <a:prstGeom prst="rect"/>
+                    <a:prstGeom prst="rect">
+                      <a:avLst/>
+                    </a:prstGeom>
+                    <a:noFill/>
                   </pic:spPr>
                 </pic:pic>
               </a:graphicData>
@@ -8375,52 +8913,51 @@
     </w:p>
     <w:p>
       <w:pPr>
-        <w:spacing w:after="360"/>
-        <w:jc w:val="left"/>
-      </w:pPr>
-      <w:r>
-        <w:rPr>
-          <w:rFonts w:ascii="Times New Roman" w:hAnsi="Times New Roman"/>
+        <w:pStyle w:val="Normal"/>
+        <w:spacing w:before="0" w:after="360"/>
+        <w:jc w:val="start"/>
+        <w:rPr/>
+      </w:pPr>
+      <w:r>
+        <w:rPr>
           <w:b/>
           <w:i/>
           <w:sz w:val="20"/>
         </w:rPr>
-        <w:t>Figura A5</w:t>
-      </w:r>
-      <w:r>
-        <w:rPr>
-          <w:rFonts w:ascii="Times New Roman" w:hAnsi="Times New Roman"/>
+        <w:t>Figura A12</w:t>
+      </w:r>
+      <w:r>
+        <w:rPr>
           <w:sz w:val="20"/>
         </w:rPr>
-        <w:t xml:space="preserve">. </w:t>
-      </w:r>
-      <w:r>
-        <w:rPr>
-          <w:rFonts w:ascii="Times New Roman" w:hAnsi="Times New Roman"/>
-          <w:sz w:val="20"/>
-        </w:rPr>
-        <w:t>Promedio de procedimientos realizados por hospital en pacientes con cáncer gástrico (C16.*). La diferencia entre hospitales alcanza hasta 6 procedimientos promedio para el mismo diagnóstico. Barras de error representan intervalos de confianza al 95%.</w:t>
-      </w:r>
-    </w:p>
-    <w:p>
-      <w:pPr>
+        <w:t>. Forest plot de interceptos aleatorios por hospital del modelo multinivel (ICC). σ²_hospital = 0.041, σ²_residual = 0.183, ICC = 18.4%. Los interceptos representan la desviación de cada hospital respecto a la media global en log(días de estadía).</w:t>
+      </w:r>
+    </w:p>
+    <w:p>
+      <w:pPr>
+        <w:pStyle w:val="Normal"/>
         <w:spacing w:before="240" w:after="80"/>
         <w:jc w:val="center"/>
-      </w:pPr>
-      <w:r>
+        <w:rPr/>
+      </w:pPr>
+      <w:r>
+        <w:rPr/>
         <w:drawing>
-          <wp:inline xmlns:a="http://schemas.openxmlformats.org/drawingml/2006/main">
-            <wp:extent cx="5029200" cy="2229689"/>
-            <wp:docPr id="6" name="Picture 6"/>
+          <wp:inline distT="0" distB="0" distL="0" distR="0">
+            <wp:extent cx="5029200" cy="2915920"/>
+            <wp:effectExtent l="0" t="0" r="0" b="0"/>
+            <wp:docPr id="13" name="Picture 13"/>
             <wp:cNvGraphicFramePr>
-              <a:graphicFrameLocks noChangeAspect="1"/>
+              <a:graphicFrameLocks xmlns:a="http://schemas.openxmlformats.org/drawingml/2006/main" noChangeAspect="1"/>
             </wp:cNvGraphicFramePr>
-            <a:graphic>
+            <a:graphic xmlns:a="http://schemas.openxmlformats.org/drawingml/2006/main">
               <a:graphicData uri="http://schemas.openxmlformats.org/drawingml/2006/picture">
-                <pic:pic>
+                <pic:pic xmlns:pic="http://schemas.openxmlformats.org/drawingml/2006/picture">
                   <pic:nvPicPr>
-                    <pic:cNvPr id="0" name="figura6_ingresos_tipo_sexo_C16.png"/>
-                    <pic:cNvPicPr/>
+                    <pic:cNvPr id="13" name="Picture 13"/>
+                    <pic:cNvPicPr>
+                      <a:picLocks noChangeAspect="1" noChangeArrowheads="1"/>
+                    </pic:cNvPicPr>
                   </pic:nvPicPr>
                   <pic:blipFill>
                     <a:blip r:embed="rId14"/>
@@ -8428,12 +8965,15 @@
                       <a:fillRect/>
                     </a:stretch>
                   </pic:blipFill>
-                  <pic:spPr>
+                  <pic:spPr bwMode="auto">
                     <a:xfrm>
                       <a:off x="0" y="0"/>
-                      <a:ext cx="5029200" cy="2229689"/>
+                      <a:ext cx="5029200" cy="2915920"/>
                     </a:xfrm>
-                    <a:prstGeom prst="rect"/>
+                    <a:prstGeom prst="rect">
+                      <a:avLst/>
+                    </a:prstGeom>
+                    <a:noFill/>
                   </pic:spPr>
                 </pic:pic>
               </a:graphicData>
@@ -8444,52 +8984,51 @@
     </w:p>
     <w:p>
       <w:pPr>
-        <w:spacing w:after="360"/>
-        <w:jc w:val="left"/>
-      </w:pPr>
-      <w:r>
-        <w:rPr>
-          <w:rFonts w:ascii="Times New Roman" w:hAnsi="Times New Roman"/>
+        <w:pStyle w:val="Normal"/>
+        <w:spacing w:before="0" w:after="360"/>
+        <w:jc w:val="start"/>
+        <w:rPr/>
+      </w:pPr>
+      <w:r>
+        <w:rPr>
           <w:b/>
           <w:i/>
           <w:sz w:val="20"/>
         </w:rPr>
-        <w:t>Figura A6</w:t>
-      </w:r>
-      <w:r>
-        <w:rPr>
-          <w:rFonts w:ascii="Times New Roman" w:hAnsi="Times New Roman"/>
+        <w:t>Figura A13</w:t>
+      </w:r>
+      <w:r>
+        <w:rPr>
           <w:sz w:val="20"/>
         </w:rPr>
-        <w:t xml:space="preserve">. </w:t>
-      </w:r>
-      <w:r>
-        <w:rPr>
-          <w:rFonts w:ascii="Times New Roman" w:hAnsi="Times New Roman"/>
-          <w:sz w:val="20"/>
-        </w:rPr>
-        <w:t>Distribución de egresos por tipo de ingreso y sexo en cáncer gástrico (C16.*). Los hombres representan aproximadamente el 60% de los ingresos. Los ingresos de urgencia concentran una mortalidad 13 veces mayor que los programados (13.9% vs. 1.1%).</w:t>
-      </w:r>
-    </w:p>
-    <w:p>
-      <w:pPr>
+        <w:t>. Distribución de días de estadía por quintil de IDH comunal en cáncer gástrico (C16.*). Pacientes de comunas Q1 presentan estadías más largas (mediana 8 vs. 6 días en Q5). Kruskal-Wallis: H(4) = 28.7, p &lt; 0.001.</w:t>
+      </w:r>
+    </w:p>
+    <w:p>
+      <w:pPr>
+        <w:pStyle w:val="Normal"/>
         <w:spacing w:before="240" w:after="80"/>
         <w:jc w:val="center"/>
-      </w:pPr>
-      <w:r>
+        <w:rPr/>
+      </w:pPr>
+      <w:r>
+        <w:rPr/>
         <w:drawing>
-          <wp:inline xmlns:a="http://schemas.openxmlformats.org/drawingml/2006/main">
-            <wp:extent cx="5029200" cy="4697083"/>
-            <wp:docPr id="7" name="Picture 7"/>
+          <wp:inline distT="0" distB="0" distL="0" distR="0">
+            <wp:extent cx="5029200" cy="3505200"/>
+            <wp:effectExtent l="0" t="0" r="0" b="0"/>
+            <wp:docPr id="14" name="Picture 14"/>
             <wp:cNvGraphicFramePr>
-              <a:graphicFrameLocks noChangeAspect="1"/>
+              <a:graphicFrameLocks xmlns:a="http://schemas.openxmlformats.org/drawingml/2006/main" noChangeAspect="1"/>
             </wp:cNvGraphicFramePr>
-            <a:graphic>
+            <a:graphic xmlns:a="http://schemas.openxmlformats.org/drawingml/2006/main">
               <a:graphicData uri="http://schemas.openxmlformats.org/drawingml/2006/picture">
-                <pic:pic>
+                <pic:pic xmlns:pic="http://schemas.openxmlformats.org/drawingml/2006/picture">
                   <pic:nvPicPr>
-                    <pic:cNvPr id="0" name="h1_dunn_heatmap_C16.png"/>
-                    <pic:cNvPicPr/>
+                    <pic:cNvPr id="14" name="Picture 14"/>
+                    <pic:cNvPicPr>
+                      <a:picLocks noChangeAspect="1" noChangeArrowheads="1"/>
+                    </pic:cNvPicPr>
                   </pic:nvPicPr>
                   <pic:blipFill>
                     <a:blip r:embed="rId15"/>
@@ -8497,12 +9036,15 @@
                       <a:fillRect/>
                     </a:stretch>
                   </pic:blipFill>
-                  <pic:spPr>
+                  <pic:spPr bwMode="auto">
                     <a:xfrm>
                       <a:off x="0" y="0"/>
-                      <a:ext cx="5029200" cy="4697083"/>
+                      <a:ext cx="5029200" cy="3505200"/>
                     </a:xfrm>
-                    <a:prstGeom prst="rect"/>
+                    <a:prstGeom prst="rect">
+                      <a:avLst/>
+                    </a:prstGeom>
+                    <a:noFill/>
                   </pic:spPr>
                 </pic:pic>
               </a:graphicData>
@@ -8513,52 +9055,51 @@
     </w:p>
     <w:p>
       <w:pPr>
-        <w:spacing w:after="360"/>
-        <w:jc w:val="left"/>
-      </w:pPr>
-      <w:r>
-        <w:rPr>
-          <w:rFonts w:ascii="Times New Roman" w:hAnsi="Times New Roman"/>
+        <w:pStyle w:val="Normal"/>
+        <w:spacing w:before="0" w:after="360"/>
+        <w:jc w:val="start"/>
+        <w:rPr/>
+      </w:pPr>
+      <w:r>
+        <w:rPr>
           <w:b/>
           <w:i/>
           <w:sz w:val="20"/>
         </w:rPr>
-        <w:t>Figura A7</w:t>
-      </w:r>
-      <w:r>
-        <w:rPr>
-          <w:rFonts w:ascii="Times New Roman" w:hAnsi="Times New Roman"/>
+        <w:t>Figura A14</w:t>
+      </w:r>
+      <w:r>
+        <w:rPr>
           <w:sz w:val="20"/>
         </w:rPr>
-        <w:t xml:space="preserve">. </w:t>
-      </w:r>
-      <w:r>
-        <w:rPr>
-          <w:rFonts w:ascii="Times New Roman" w:hAnsi="Times New Roman"/>
-          <w:sz w:val="20"/>
-        </w:rPr>
-        <w:t>Heatmap de p-valores ajustados del test post-hoc Dunn-Bonferroni para cantidad de procedimientos entre pares de hospitales (H₁). Celdas oscuras indican pares con diferencias estadísticamente significativas (p &lt; 0.05). El 61.8% de los pares muestran diferencias significativas.</w:t>
-      </w:r>
-    </w:p>
-    <w:p>
-      <w:pPr>
+        <w:t>. Tasa de mortalidad intrahospitalaria por quintil de IDH comunal en cáncer gástrico (C16.*). Gradiente de mortalidad: Q1 = 5.2%, Q5 = 2.4%. Diferencia Q1–Q5: 2.8 pp (117% en términos relativos). χ²(4) = 14.2, p = 0.003.</w:t>
+      </w:r>
+    </w:p>
+    <w:p>
+      <w:pPr>
+        <w:pStyle w:val="Normal"/>
         <w:spacing w:before="240" w:after="80"/>
         <w:jc w:val="center"/>
-      </w:pPr>
-      <w:r>
+        <w:rPr/>
+      </w:pPr>
+      <w:r>
+        <w:rPr/>
         <w:drawing>
-          <wp:inline xmlns:a="http://schemas.openxmlformats.org/drawingml/2006/main">
-            <wp:extent cx="5029200" cy="5012209"/>
-            <wp:docPr id="8" name="Picture 8"/>
+          <wp:inline distT="0" distB="0" distL="0" distR="0">
+            <wp:extent cx="5029200" cy="3193415"/>
+            <wp:effectExtent l="0" t="0" r="0" b="0"/>
+            <wp:docPr id="15" name="Picture 15"/>
             <wp:cNvGraphicFramePr>
-              <a:graphicFrameLocks noChangeAspect="1"/>
+              <a:graphicFrameLocks xmlns:a="http://schemas.openxmlformats.org/drawingml/2006/main" noChangeAspect="1"/>
             </wp:cNvGraphicFramePr>
-            <a:graphic>
+            <a:graphic xmlns:a="http://schemas.openxmlformats.org/drawingml/2006/main">
               <a:graphicData uri="http://schemas.openxmlformats.org/drawingml/2006/picture">
-                <pic:pic>
+                <pic:pic xmlns:pic="http://schemas.openxmlformats.org/drawingml/2006/picture">
                   <pic:nvPicPr>
-                    <pic:cNvPr id="0" name="h2_roc_curve_C16.png"/>
-                    <pic:cNvPicPr/>
+                    <pic:cNvPr id="15" name="Picture 15"/>
+                    <pic:cNvPicPr>
+                      <a:picLocks noChangeAspect="1" noChangeArrowheads="1"/>
+                    </pic:cNvPicPr>
                   </pic:nvPicPr>
                   <pic:blipFill>
                     <a:blip r:embed="rId16"/>
@@ -8566,12 +9107,15 @@
                       <a:fillRect/>
                     </a:stretch>
                   </pic:blipFill>
-                  <pic:spPr>
+                  <pic:spPr bwMode="auto">
                     <a:xfrm>
                       <a:off x="0" y="0"/>
-                      <a:ext cx="5029200" cy="5012209"/>
+                      <a:ext cx="5029200" cy="3193415"/>
                     </a:xfrm>
-                    <a:prstGeom prst="rect"/>
+                    <a:prstGeom prst="rect">
+                      <a:avLst/>
+                    </a:prstGeom>
+                    <a:noFill/>
                   </pic:spPr>
                 </pic:pic>
               </a:graphicData>
@@ -8582,52 +9126,51 @@
     </w:p>
     <w:p>
       <w:pPr>
-        <w:spacing w:after="360"/>
-        <w:jc w:val="left"/>
-      </w:pPr>
-      <w:r>
-        <w:rPr>
-          <w:rFonts w:ascii="Times New Roman" w:hAnsi="Times New Roman"/>
+        <w:pStyle w:val="Normal"/>
+        <w:spacing w:before="0" w:after="360"/>
+        <w:jc w:val="start"/>
+        <w:rPr/>
+      </w:pPr>
+      <w:r>
+        <w:rPr>
           <w:b/>
           <w:i/>
           <w:sz w:val="20"/>
         </w:rPr>
-        <w:t>Figura A8</w:t>
-      </w:r>
-      <w:r>
-        <w:rPr>
-          <w:rFonts w:ascii="Times New Roman" w:hAnsi="Times New Roman"/>
+        <w:t>Figura A15</w:t>
+      </w:r>
+      <w:r>
+        <w:rPr>
           <w:sz w:val="20"/>
         </w:rPr>
-        <w:t xml:space="preserve">. </w:t>
-      </w:r>
-      <w:r>
-        <w:rPr>
-          <w:rFonts w:ascii="Times New Roman" w:hAnsi="Times New Roman"/>
-          <w:sz w:val="20"/>
-        </w:rPr>
-        <w:t>Curva ROC del modelo de regresión logística para mortalidad intrahospitalaria (H₂). AUC = 0.823, indicando capacidad discriminativa buena. Modelo ajustado por procedimientos, edad, severidad GRD, peso GRD, comorbilidad y hospital.</w:t>
-      </w:r>
-    </w:p>
-    <w:p>
-      <w:pPr>
+        <w:t>. Proyección PCA de hospitales según clustering K-means (k = 3, silhouette = 0.43) en cáncer gástrico (C16.*). Las tres tipologías identificadas son: alta complejidad/urgente (Cluster 0), perfil quirúrgico (Cluster 1) y hospital general (Cluster 2).</w:t>
+      </w:r>
+    </w:p>
+    <w:p>
+      <w:pPr>
+        <w:pStyle w:val="Normal"/>
         <w:spacing w:before="240" w:after="80"/>
         <w:jc w:val="center"/>
-      </w:pPr>
-      <w:r>
+        <w:rPr/>
+      </w:pPr>
+      <w:r>
+        <w:rPr/>
         <w:drawing>
-          <wp:inline xmlns:a="http://schemas.openxmlformats.org/drawingml/2006/main">
-            <wp:extent cx="5029200" cy="3523513"/>
-            <wp:docPr id="9" name="Picture 9"/>
+          <wp:inline distT="0" distB="0" distL="0" distR="0">
+            <wp:extent cx="5029200" cy="2092960"/>
+            <wp:effectExtent l="0" t="0" r="0" b="0"/>
+            <wp:docPr id="16" name="Picture 16"/>
             <wp:cNvGraphicFramePr>
-              <a:graphicFrameLocks noChangeAspect="1"/>
+              <a:graphicFrameLocks xmlns:a="http://schemas.openxmlformats.org/drawingml/2006/main" noChangeAspect="1"/>
             </wp:cNvGraphicFramePr>
-            <a:graphic>
+            <a:graphic xmlns:a="http://schemas.openxmlformats.org/drawingml/2006/main">
               <a:graphicData uri="http://schemas.openxmlformats.org/drawingml/2006/picture">
-                <pic:pic>
+                <pic:pic xmlns:pic="http://schemas.openxmlformats.org/drawingml/2006/picture">
                   <pic:nvPicPr>
-                    <pic:cNvPr id="0" name="h2_forest_plot_OR_C16.png"/>
-                    <pic:cNvPicPr/>
+                    <pic:cNvPr id="16" name="Picture 16"/>
+                    <pic:cNvPicPr>
+                      <a:picLocks noChangeAspect="1" noChangeArrowheads="1"/>
+                    </pic:cNvPicPr>
                   </pic:nvPicPr>
                   <pic:blipFill>
                     <a:blip r:embed="rId17"/>
@@ -8635,12 +9178,15 @@
                       <a:fillRect/>
                     </a:stretch>
                   </pic:blipFill>
-                  <pic:spPr>
+                  <pic:spPr bwMode="auto">
                     <a:xfrm>
                       <a:off x="0" y="0"/>
-                      <a:ext cx="5029200" cy="3523513"/>
+                      <a:ext cx="5029200" cy="2092960"/>
                     </a:xfrm>
-                    <a:prstGeom prst="rect"/>
+                    <a:prstGeom prst="rect">
+                      <a:avLst/>
+                    </a:prstGeom>
+                    <a:noFill/>
                   </pic:spPr>
                 </pic:pic>
               </a:graphicData>
@@ -8651,52 +9197,51 @@
     </w:p>
     <w:p>
       <w:pPr>
-        <w:spacing w:after="360"/>
-        <w:jc w:val="left"/>
-      </w:pPr>
-      <w:r>
-        <w:rPr>
-          <w:rFonts w:ascii="Times New Roman" w:hAnsi="Times New Roman"/>
+        <w:pStyle w:val="Normal"/>
+        <w:spacing w:before="0" w:after="360"/>
+        <w:jc w:val="start"/>
+        <w:rPr/>
+      </w:pPr>
+      <w:r>
+        <w:rPr>
           <w:b/>
           <w:i/>
           <w:sz w:val="20"/>
         </w:rPr>
-        <w:t>Figura A9</w:t>
-      </w:r>
-      <w:r>
-        <w:rPr>
-          <w:rFonts w:ascii="Times New Roman" w:hAnsi="Times New Roman"/>
+        <w:t>Figura A16</w:t>
+      </w:r>
+      <w:r>
+        <w:rPr>
           <w:sz w:val="20"/>
         </w:rPr>
-        <w:t xml:space="preserve">. </w:t>
-      </w:r>
-      <w:r>
-        <w:rPr>
-          <w:rFonts w:ascii="Times New Roman" w:hAnsi="Times New Roman"/>
-          <w:sz w:val="20"/>
-        </w:rPr>
-        <w:t>Forest plot de odds ratios ajustados del modelo de regresión logística para mortalidad intrahospitalaria (H₂). La severidad GRD es el predictor dominante (OR = 6.12). Los intervalos de confianza son al 95%.</w:t>
-      </w:r>
-    </w:p>
-    <w:p>
-      <w:pPr>
+        <w:t>. Heatmap de centroides normalizados por cluster hospitalario (K-means, k = 3). Los perfiles muestran diferenciación clara en las variables de desempeño institucional: procedimientos, estadía, severidad, mortalidad y proporción de urgencias.</w:t>
+      </w:r>
+    </w:p>
+    <w:p>
+      <w:pPr>
+        <w:pStyle w:val="Normal"/>
         <w:spacing w:before="240" w:after="80"/>
         <w:jc w:val="center"/>
-      </w:pPr>
-      <w:r>
+        <w:rPr/>
+      </w:pPr>
+      <w:r>
+        <w:rPr/>
         <w:drawing>
-          <wp:inline xmlns:a="http://schemas.openxmlformats.org/drawingml/2006/main">
-            <wp:extent cx="5029200" cy="5029200"/>
-            <wp:docPr id="10" name="Picture 10"/>
+          <wp:inline distT="0" distB="0" distL="0" distR="0">
+            <wp:extent cx="5029200" cy="4466590"/>
+            <wp:effectExtent l="0" t="0" r="0" b="0"/>
+            <wp:docPr id="17" name="Picture 17"/>
             <wp:cNvGraphicFramePr>
-              <a:graphicFrameLocks noChangeAspect="1"/>
+              <a:graphicFrameLocks xmlns:a="http://schemas.openxmlformats.org/drawingml/2006/main" noChangeAspect="1"/>
             </wp:cNvGraphicFramePr>
-            <a:graphic>
+            <a:graphic xmlns:a="http://schemas.openxmlformats.org/drawingml/2006/main">
               <a:graphicData uri="http://schemas.openxmlformats.org/drawingml/2006/picture">
-                <pic:pic>
+                <pic:pic xmlns:pic="http://schemas.openxmlformats.org/drawingml/2006/picture">
                   <pic:nvPicPr>
-                    <pic:cNvPr id="0" name="h3_pred_vs_obs_C16.png"/>
-                    <pic:cNvPicPr/>
+                    <pic:cNvPr id="17" name="Picture 17"/>
+                    <pic:cNvPicPr>
+                      <a:picLocks noChangeAspect="1" noChangeArrowheads="1"/>
+                    </pic:cNvPicPr>
                   </pic:nvPicPr>
                   <pic:blipFill>
                     <a:blip r:embed="rId18"/>
@@ -8704,12 +9249,15 @@
                       <a:fillRect/>
                     </a:stretch>
                   </pic:blipFill>
-                  <pic:spPr>
+                  <pic:spPr bwMode="auto">
                     <a:xfrm>
                       <a:off x="0" y="0"/>
-                      <a:ext cx="5029200" cy="5029200"/>
+                      <a:ext cx="5029200" cy="4466590"/>
                     </a:xfrm>
-                    <a:prstGeom prst="rect"/>
+                    <a:prstGeom prst="rect">
+                      <a:avLst/>
+                    </a:prstGeom>
+                    <a:noFill/>
                   </pic:spPr>
                 </pic:pic>
               </a:graphicData>
@@ -8720,52 +9268,51 @@
     </w:p>
     <w:p>
       <w:pPr>
-        <w:spacing w:after="360"/>
-        <w:jc w:val="left"/>
-      </w:pPr>
-      <w:r>
-        <w:rPr>
-          <w:rFonts w:ascii="Times New Roman" w:hAnsi="Times New Roman"/>
+        <w:pStyle w:val="Normal"/>
+        <w:spacing w:before="0" w:after="360"/>
+        <w:jc w:val="start"/>
+        <w:rPr/>
+      </w:pPr>
+      <w:r>
+        <w:rPr>
           <w:b/>
           <w:i/>
           <w:sz w:val="20"/>
         </w:rPr>
-        <w:t>Figura A10</w:t>
-      </w:r>
-      <w:r>
-        <w:rPr>
-          <w:rFonts w:ascii="Times New Roman" w:hAnsi="Times New Roman"/>
+        <w:t>Figura A17</w:t>
+      </w:r>
+      <w:r>
+        <w:rPr>
           <w:sz w:val="20"/>
         </w:rPr>
-        <w:t xml:space="preserve">. </w:t>
-      </w:r>
-      <w:r>
-        <w:rPr>
-          <w:rFonts w:ascii="Times New Roman" w:hAnsi="Times New Roman"/>
-          <w:sz w:val="20"/>
-        </w:rPr>
-        <w:t>Valores predichos versus observados del modelo OLS para log(1 + días de estadía) (H₃). R² = 0.636. Errores estándar robustos HC3. La línea de 45° indica predicción perfecta.</w:t>
-      </w:r>
-    </w:p>
-    <w:p>
-      <w:pPr>
+        <w:t>. Comparación de curvas ROC entre tres estrategias para el desbalance de clase en el modelo logístico: (1) Baseline sin ajuste, (2) class_weight='balanced', y (3) SMOTE. Ambas estrategias de reequilibrio mejoran la sensibilidad del modelo.</w:t>
+      </w:r>
+    </w:p>
+    <w:p>
+      <w:pPr>
+        <w:pStyle w:val="Normal"/>
         <w:spacing w:before="240" w:after="80"/>
         <w:jc w:val="center"/>
-      </w:pPr>
-      <w:r>
+        <w:rPr/>
+      </w:pPr>
+      <w:r>
+        <w:rPr/>
         <w:drawing>
-          <wp:inline xmlns:a="http://schemas.openxmlformats.org/drawingml/2006/main">
-            <wp:extent cx="5029200" cy="4449743"/>
-            <wp:docPr id="11" name="Picture 11"/>
+          <wp:inline distT="0" distB="0" distL="0" distR="0">
+            <wp:extent cx="5029200" cy="1736725"/>
+            <wp:effectExtent l="0" t="0" r="0" b="0"/>
+            <wp:docPr id="18" name="Picture 18"/>
             <wp:cNvGraphicFramePr>
-              <a:graphicFrameLocks noChangeAspect="1"/>
+              <a:graphicFrameLocks xmlns:a="http://schemas.openxmlformats.org/drawingml/2006/main" noChangeAspect="1"/>
             </wp:cNvGraphicFramePr>
-            <a:graphic>
+            <a:graphic xmlns:a="http://schemas.openxmlformats.org/drawingml/2006/main">
               <a:graphicData uri="http://schemas.openxmlformats.org/drawingml/2006/picture">
-                <pic:pic>
+                <pic:pic xmlns:pic="http://schemas.openxmlformats.org/drawingml/2006/picture">
                   <pic:nvPicPr>
-                    <pic:cNvPr id="0" name="h3_residual_diagnostics_C16.png"/>
-                    <pic:cNvPicPr/>
+                    <pic:cNvPr id="18" name="Picture 18"/>
+                    <pic:cNvPicPr>
+                      <a:picLocks noChangeAspect="1" noChangeArrowheads="1"/>
+                    </pic:cNvPicPr>
                   </pic:nvPicPr>
                   <pic:blipFill>
                     <a:blip r:embed="rId19"/>
@@ -8773,12 +9320,15 @@
                       <a:fillRect/>
                     </a:stretch>
                   </pic:blipFill>
-                  <pic:spPr>
+                  <pic:spPr bwMode="auto">
                     <a:xfrm>
                       <a:off x="0" y="0"/>
-                      <a:ext cx="5029200" cy="4449743"/>
+                      <a:ext cx="5029200" cy="1736725"/>
                     </a:xfrm>
-                    <a:prstGeom prst="rect"/>
+                    <a:prstGeom prst="rect">
+                      <a:avLst/>
+                    </a:prstGeom>
+                    <a:noFill/>
                   </pic:spPr>
                 </pic:pic>
               </a:graphicData>
@@ -8789,520 +9339,30 @@
     </w:p>
     <w:p>
       <w:pPr>
-        <w:spacing w:after="360"/>
-        <w:jc w:val="left"/>
-      </w:pPr>
-      <w:r>
-        <w:rPr>
-          <w:rFonts w:ascii="Times New Roman" w:hAnsi="Times New Roman"/>
+        <w:pStyle w:val="Normal"/>
+        <w:spacing w:before="0" w:after="360"/>
+        <w:jc w:val="start"/>
+        <w:rPr/>
+      </w:pPr>
+      <w:r>
+        <w:rPr>
           <w:b/>
           <w:i/>
           <w:sz w:val="20"/>
         </w:rPr>
-        <w:t>Figura A11</w:t>
-      </w:r>
-      <w:r>
-        <w:rPr>
-          <w:rFonts w:ascii="Times New Roman" w:hAnsi="Times New Roman"/>
+        <w:t>Figura A18</w:t>
+      </w:r>
+      <w:r>
+        <w:rPr>
           <w:sz w:val="20"/>
         </w:rPr>
-        <w:t xml:space="preserve">. </w:t>
-      </w:r>
-      <w:r>
-        <w:rPr>
-          <w:rFonts w:ascii="Times New Roman" w:hAnsi="Times New Roman"/>
-          <w:sz w:val="20"/>
-        </w:rPr>
-        <w:t>Panel de diagnóstico de residuos del modelo OLS (H₃). Incluye: residuos vs. valores ajustados, Q-Q plot de normalidad, histograma de residuos y residuos vs. leverage. Los patrones son consistentes con un ajuste razonable del modelo.</w:t>
-      </w:r>
-    </w:p>
-    <w:p>
-      <w:pPr>
-        <w:spacing w:before="240" w:after="80"/>
-        <w:jc w:val="center"/>
-      </w:pPr>
-      <w:r>
-        <w:drawing>
-          <wp:inline xmlns:a="http://schemas.openxmlformats.org/drawingml/2006/main">
-            <wp:extent cx="5029200" cy="3376507"/>
-            <wp:docPr id="12" name="Picture 12"/>
-            <wp:cNvGraphicFramePr>
-              <a:graphicFrameLocks noChangeAspect="1"/>
-            </wp:cNvGraphicFramePr>
-            <a:graphic>
-              <a:graphicData uri="http://schemas.openxmlformats.org/drawingml/2006/picture">
-                <pic:pic>
-                  <pic:nvPicPr>
-                    <pic:cNvPr id="0" name="figura15_forest_interceptos_hospital.png"/>
-                    <pic:cNvPicPr/>
-                  </pic:nvPicPr>
-                  <pic:blipFill>
-                    <a:blip r:embed="rId20"/>
-                    <a:stretch>
-                      <a:fillRect/>
-                    </a:stretch>
-                  </pic:blipFill>
-                  <pic:spPr>
-                    <a:xfrm>
-                      <a:off x="0" y="0"/>
-                      <a:ext cx="5029200" cy="3376507"/>
-                    </a:xfrm>
-                    <a:prstGeom prst="rect"/>
-                  </pic:spPr>
-                </pic:pic>
-              </a:graphicData>
-            </a:graphic>
-          </wp:inline>
-        </w:drawing>
-      </w:r>
-    </w:p>
-    <w:p>
-      <w:pPr>
-        <w:spacing w:after="360"/>
-        <w:jc w:val="left"/>
-      </w:pPr>
-      <w:r>
-        <w:rPr>
-          <w:rFonts w:ascii="Times New Roman" w:hAnsi="Times New Roman"/>
-          <w:b/>
-          <w:i/>
-          <w:sz w:val="20"/>
-        </w:rPr>
-        <w:t>Figura A12</w:t>
-      </w:r>
-      <w:r>
-        <w:rPr>
-          <w:rFonts w:ascii="Times New Roman" w:hAnsi="Times New Roman"/>
-          <w:sz w:val="20"/>
-        </w:rPr>
-        <w:t xml:space="preserve">. </w:t>
-      </w:r>
-      <w:r>
-        <w:rPr>
-          <w:rFonts w:ascii="Times New Roman" w:hAnsi="Times New Roman"/>
-          <w:sz w:val="20"/>
-        </w:rPr>
-        <w:t>Forest plot de interceptos aleatorios por hospital del modelo multinivel (ICC). σ²_hospital = 0.041, σ²_residual = 0.183, ICC = 18.4%. Los interceptos representan la desviación de cada hospital respecto a la media global en log(días de estadía).</w:t>
-      </w:r>
-    </w:p>
-    <w:p>
-      <w:pPr>
-        <w:spacing w:before="240" w:after="80"/>
-        <w:jc w:val="center"/>
-      </w:pPr>
-      <w:r>
-        <w:drawing>
-          <wp:inline xmlns:a="http://schemas.openxmlformats.org/drawingml/2006/main">
-            <wp:extent cx="5029200" cy="2916091"/>
-            <wp:docPr id="13" name="Picture 13"/>
-            <wp:cNvGraphicFramePr>
-              <a:graphicFrameLocks noChangeAspect="1"/>
-            </wp:cNvGraphicFramePr>
-            <a:graphic>
-              <a:graphicData uri="http://schemas.openxmlformats.org/drawingml/2006/picture">
-                <pic:pic>
-                  <pic:nvPicPr>
-                    <pic:cNvPr id="0" name="figura16_boxplot_estadia_por_IDH.png"/>
-                    <pic:cNvPicPr/>
-                  </pic:nvPicPr>
-                  <pic:blipFill>
-                    <a:blip r:embed="rId21"/>
-                    <a:stretch>
-                      <a:fillRect/>
-                    </a:stretch>
-                  </pic:blipFill>
-                  <pic:spPr>
-                    <a:xfrm>
-                      <a:off x="0" y="0"/>
-                      <a:ext cx="5029200" cy="2916091"/>
-                    </a:xfrm>
-                    <a:prstGeom prst="rect"/>
-                  </pic:spPr>
-                </pic:pic>
-              </a:graphicData>
-            </a:graphic>
-          </wp:inline>
-        </w:drawing>
-      </w:r>
-    </w:p>
-    <w:p>
-      <w:pPr>
-        <w:spacing w:after="360"/>
-        <w:jc w:val="left"/>
-      </w:pPr>
-      <w:r>
-        <w:rPr>
-          <w:rFonts w:ascii="Times New Roman" w:hAnsi="Times New Roman"/>
-          <w:b/>
-          <w:i/>
-          <w:sz w:val="20"/>
-        </w:rPr>
-        <w:t>Figura A13</w:t>
-      </w:r>
-      <w:r>
-        <w:rPr>
-          <w:rFonts w:ascii="Times New Roman" w:hAnsi="Times New Roman"/>
-          <w:sz w:val="20"/>
-        </w:rPr>
-        <w:t xml:space="preserve">. </w:t>
-      </w:r>
-      <w:r>
-        <w:rPr>
-          <w:rFonts w:ascii="Times New Roman" w:hAnsi="Times New Roman"/>
-          <w:sz w:val="20"/>
-        </w:rPr>
-        <w:t>Distribución de días de estadía por quintil de IDH comunal en cáncer gástrico (C16.*). Pacientes de comunas Q1 presentan estadías más largas (mediana 8 vs. 6 días en Q5). Kruskal-Wallis: H(4) = 28.7, p &lt; 0.001.</w:t>
-      </w:r>
-    </w:p>
-    <w:p>
-      <w:pPr>
-        <w:spacing w:before="240" w:after="80"/>
-        <w:jc w:val="center"/>
-      </w:pPr>
-      <w:r>
-        <w:drawing>
-          <wp:inline xmlns:a="http://schemas.openxmlformats.org/drawingml/2006/main">
-            <wp:extent cx="5029200" cy="3505200"/>
-            <wp:docPr id="14" name="Picture 14"/>
-            <wp:cNvGraphicFramePr>
-              <a:graphicFrameLocks noChangeAspect="1"/>
-            </wp:cNvGraphicFramePr>
-            <a:graphic>
-              <a:graphicData uri="http://schemas.openxmlformats.org/drawingml/2006/picture">
-                <pic:pic>
-                  <pic:nvPicPr>
-                    <pic:cNvPr id="0" name="figura17_mortalidad_por_IDH.png"/>
-                    <pic:cNvPicPr/>
-                  </pic:nvPicPr>
-                  <pic:blipFill>
-                    <a:blip r:embed="rId22"/>
-                    <a:stretch>
-                      <a:fillRect/>
-                    </a:stretch>
-                  </pic:blipFill>
-                  <pic:spPr>
-                    <a:xfrm>
-                      <a:off x="0" y="0"/>
-                      <a:ext cx="5029200" cy="3505200"/>
-                    </a:xfrm>
-                    <a:prstGeom prst="rect"/>
-                  </pic:spPr>
-                </pic:pic>
-              </a:graphicData>
-            </a:graphic>
-          </wp:inline>
-        </w:drawing>
-      </w:r>
-    </w:p>
-    <w:p>
-      <w:pPr>
-        <w:spacing w:after="360"/>
-        <w:jc w:val="left"/>
-      </w:pPr>
-      <w:r>
-        <w:rPr>
-          <w:rFonts w:ascii="Times New Roman" w:hAnsi="Times New Roman"/>
-          <w:b/>
-          <w:i/>
-          <w:sz w:val="20"/>
-        </w:rPr>
-        <w:t>Figura A14</w:t>
-      </w:r>
-      <w:r>
-        <w:rPr>
-          <w:rFonts w:ascii="Times New Roman" w:hAnsi="Times New Roman"/>
-          <w:sz w:val="20"/>
-        </w:rPr>
-        <w:t xml:space="preserve">. </w:t>
-      </w:r>
-      <w:r>
-        <w:rPr>
-          <w:rFonts w:ascii="Times New Roman" w:hAnsi="Times New Roman"/>
-          <w:sz w:val="20"/>
-        </w:rPr>
-        <w:t>Tasa de mortalidad intrahospitalaria por quintil de IDH comunal en cáncer gástrico (C16.*). Gradiente de mortalidad: Q1 = 5.2%, Q5 = 2.4%. Diferencia Q1–Q5: 2.8 pp (117% en términos relativos). χ²(4) = 14.2, p = 0.003.</w:t>
-      </w:r>
-    </w:p>
-    <w:p>
-      <w:pPr>
-        <w:spacing w:before="240" w:after="80"/>
-        <w:jc w:val="center"/>
-      </w:pPr>
-      <w:r>
-        <w:drawing>
-          <wp:inline xmlns:a="http://schemas.openxmlformats.org/drawingml/2006/main">
-            <wp:extent cx="5029200" cy="3193388"/>
-            <wp:docPr id="15" name="Picture 15"/>
-            <wp:cNvGraphicFramePr>
-              <a:graphicFrameLocks noChangeAspect="1"/>
-            </wp:cNvGraphicFramePr>
-            <a:graphic>
-              <a:graphicData uri="http://schemas.openxmlformats.org/drawingml/2006/picture">
-                <pic:pic>
-                  <pic:nvPicPr>
-                    <pic:cNvPr id="0" name="figura_18_kmeans_pca_hospitales_C16.png"/>
-                    <pic:cNvPicPr/>
-                  </pic:nvPicPr>
-                  <pic:blipFill>
-                    <a:blip r:embed="rId23"/>
-                    <a:stretch>
-                      <a:fillRect/>
-                    </a:stretch>
-                  </pic:blipFill>
-                  <pic:spPr>
-                    <a:xfrm>
-                      <a:off x="0" y="0"/>
-                      <a:ext cx="5029200" cy="3193388"/>
-                    </a:xfrm>
-                    <a:prstGeom prst="rect"/>
-                  </pic:spPr>
-                </pic:pic>
-              </a:graphicData>
-            </a:graphic>
-          </wp:inline>
-        </w:drawing>
-      </w:r>
-    </w:p>
-    <w:p>
-      <w:pPr>
-        <w:spacing w:after="360"/>
-        <w:jc w:val="left"/>
-      </w:pPr>
-      <w:r>
-        <w:rPr>
-          <w:rFonts w:ascii="Times New Roman" w:hAnsi="Times New Roman"/>
-          <w:b/>
-          <w:i/>
-          <w:sz w:val="20"/>
-        </w:rPr>
-        <w:t>Figura A15</w:t>
-      </w:r>
-      <w:r>
-        <w:rPr>
-          <w:rFonts w:ascii="Times New Roman" w:hAnsi="Times New Roman"/>
-          <w:sz w:val="20"/>
-        </w:rPr>
-        <w:t xml:space="preserve">. </w:t>
-      </w:r>
-      <w:r>
-        <w:rPr>
-          <w:rFonts w:ascii="Times New Roman" w:hAnsi="Times New Roman"/>
-          <w:sz w:val="20"/>
-        </w:rPr>
-        <w:t>Proyección PCA de hospitales según clustering K-means (k = 3, silhouette = 0.43) en cáncer gástrico (C16.*). Las tres tipologías identificadas son: alta complejidad/urgente (Cluster 0), perfil quirúrgico (Cluster 1) y hospital general (Cluster 2).</w:t>
-      </w:r>
-    </w:p>
-    <w:p>
-      <w:pPr>
-        <w:spacing w:before="240" w:after="80"/>
-        <w:jc w:val="center"/>
-      </w:pPr>
-      <w:r>
-        <w:drawing>
-          <wp:inline xmlns:a="http://schemas.openxmlformats.org/drawingml/2006/main">
-            <wp:extent cx="5029200" cy="2092519"/>
-            <wp:docPr id="16" name="Picture 16"/>
-            <wp:cNvGraphicFramePr>
-              <a:graphicFrameLocks noChangeAspect="1"/>
-            </wp:cNvGraphicFramePr>
-            <a:graphic>
-              <a:graphicData uri="http://schemas.openxmlformats.org/drawingml/2006/picture">
-                <pic:pic>
-                  <pic:nvPicPr>
-                    <pic:cNvPr id="0" name="figura_19_kmeans_heatmap_perfiles_C16.png"/>
-                    <pic:cNvPicPr/>
-                  </pic:nvPicPr>
-                  <pic:blipFill>
-                    <a:blip r:embed="rId24"/>
-                    <a:stretch>
-                      <a:fillRect/>
-                    </a:stretch>
-                  </pic:blipFill>
-                  <pic:spPr>
-                    <a:xfrm>
-                      <a:off x="0" y="0"/>
-                      <a:ext cx="5029200" cy="2092519"/>
-                    </a:xfrm>
-                    <a:prstGeom prst="rect"/>
-                  </pic:spPr>
-                </pic:pic>
-              </a:graphicData>
-            </a:graphic>
-          </wp:inline>
-        </w:drawing>
-      </w:r>
-    </w:p>
-    <w:p>
-      <w:pPr>
-        <w:spacing w:after="360"/>
-        <w:jc w:val="left"/>
-      </w:pPr>
-      <w:r>
-        <w:rPr>
-          <w:rFonts w:ascii="Times New Roman" w:hAnsi="Times New Roman"/>
-          <w:b/>
-          <w:i/>
-          <w:sz w:val="20"/>
-        </w:rPr>
-        <w:t>Figura A16</w:t>
-      </w:r>
-      <w:r>
-        <w:rPr>
-          <w:rFonts w:ascii="Times New Roman" w:hAnsi="Times New Roman"/>
-          <w:sz w:val="20"/>
-        </w:rPr>
-        <w:t xml:space="preserve">. </w:t>
-      </w:r>
-      <w:r>
-        <w:rPr>
-          <w:rFonts w:ascii="Times New Roman" w:hAnsi="Times New Roman"/>
-          <w:sz w:val="20"/>
-        </w:rPr>
-        <w:t>Heatmap de centroides normalizados por cluster hospitalario (K-means, k = 3). Los perfiles muestran diferenciación clara en las variables de desempeño institucional: procedimientos, estadía, severidad, mortalidad y proporción de urgencias.</w:t>
-      </w:r>
-    </w:p>
-    <w:p>
-      <w:pPr>
-        <w:spacing w:before="240" w:after="80"/>
-        <w:jc w:val="center"/>
-      </w:pPr>
-      <w:r>
-        <w:drawing>
-          <wp:inline xmlns:a="http://schemas.openxmlformats.org/drawingml/2006/main">
-            <wp:extent cx="5029200" cy="4467046"/>
-            <wp:docPr id="17" name="Picture 17"/>
-            <wp:cNvGraphicFramePr>
-              <a:graphicFrameLocks noChangeAspect="1"/>
-            </wp:cNvGraphicFramePr>
-            <a:graphic>
-              <a:graphicData uri="http://schemas.openxmlformats.org/drawingml/2006/picture">
-                <pic:pic>
-                  <pic:nvPicPr>
-                    <pic:cNvPr id="0" name="figura20_roc_comparativo_desbalance_C16.png"/>
-                    <pic:cNvPicPr/>
-                  </pic:nvPicPr>
-                  <pic:blipFill>
-                    <a:blip r:embed="rId25"/>
-                    <a:stretch>
-                      <a:fillRect/>
-                    </a:stretch>
-                  </pic:blipFill>
-                  <pic:spPr>
-                    <a:xfrm>
-                      <a:off x="0" y="0"/>
-                      <a:ext cx="5029200" cy="4467046"/>
-                    </a:xfrm>
-                    <a:prstGeom prst="rect"/>
-                  </pic:spPr>
-                </pic:pic>
-              </a:graphicData>
-            </a:graphic>
-          </wp:inline>
-        </w:drawing>
-      </w:r>
-    </w:p>
-    <w:p>
-      <w:pPr>
-        <w:spacing w:after="360"/>
-        <w:jc w:val="left"/>
-      </w:pPr>
-      <w:r>
-        <w:rPr>
-          <w:rFonts w:ascii="Times New Roman" w:hAnsi="Times New Roman"/>
-          <w:b/>
-          <w:i/>
-          <w:sz w:val="20"/>
-        </w:rPr>
-        <w:t>Figura A17</w:t>
-      </w:r>
-      <w:r>
-        <w:rPr>
-          <w:rFonts w:ascii="Times New Roman" w:hAnsi="Times New Roman"/>
-          <w:sz w:val="20"/>
-        </w:rPr>
-        <w:t xml:space="preserve">. </w:t>
-      </w:r>
-      <w:r>
-        <w:rPr>
-          <w:rFonts w:ascii="Times New Roman" w:hAnsi="Times New Roman"/>
-          <w:sz w:val="20"/>
-        </w:rPr>
-        <w:t>Comparación de curvas ROC entre tres estrategias para el desbalance de clase en el modelo logístico: (1) Baseline sin ajuste, (2) class_weight='balanced', y (3) SMOTE. Ambas estrategias de reequilibrio mejoran la sensibilidad del modelo.</w:t>
-      </w:r>
-    </w:p>
-    <w:p>
-      <w:pPr>
-        <w:spacing w:before="240" w:after="80"/>
-        <w:jc w:val="center"/>
-      </w:pPr>
-      <w:r>
-        <w:drawing>
-          <wp:inline xmlns:a="http://schemas.openxmlformats.org/drawingml/2006/main">
-            <wp:extent cx="5029200" cy="1737155"/>
-            <wp:docPr id="18" name="Picture 18"/>
-            <wp:cNvGraphicFramePr>
-              <a:graphicFrameLocks noChangeAspect="1"/>
-            </wp:cNvGraphicFramePr>
-            <a:graphic>
-              <a:graphicData uri="http://schemas.openxmlformats.org/drawingml/2006/picture">
-                <pic:pic>
-                  <pic:nvPicPr>
-                    <pic:cNvPr id="0" name="figura21_sensibilidad_umbral_C16.png"/>
-                    <pic:cNvPicPr/>
-                  </pic:nvPicPr>
-                  <pic:blipFill>
-                    <a:blip r:embed="rId26"/>
-                    <a:stretch>
-                      <a:fillRect/>
-                    </a:stretch>
-                  </pic:blipFill>
-                  <pic:spPr>
-                    <a:xfrm>
-                      <a:off x="0" y="0"/>
-                      <a:ext cx="5029200" cy="1737155"/>
-                    </a:xfrm>
-                    <a:prstGeom prst="rect"/>
-                  </pic:spPr>
-                </pic:pic>
-              </a:graphicData>
-            </a:graphic>
-          </wp:inline>
-        </w:drawing>
-      </w:r>
-    </w:p>
-    <w:p>
-      <w:pPr>
-        <w:spacing w:after="360"/>
-        <w:jc w:val="left"/>
-      </w:pPr>
-      <w:r>
-        <w:rPr>
-          <w:rFonts w:ascii="Times New Roman" w:hAnsi="Times New Roman"/>
-          <w:b/>
-          <w:i/>
-          <w:sz w:val="20"/>
-        </w:rPr>
-        <w:t>Figura A18</w:t>
-      </w:r>
-      <w:r>
-        <w:rPr>
-          <w:rFonts w:ascii="Times New Roman" w:hAnsi="Times New Roman"/>
-          <w:sz w:val="20"/>
-        </w:rPr>
-        <w:t xml:space="preserve">. </w:t>
-      </w:r>
-      <w:r>
-        <w:rPr>
-          <w:rFonts w:ascii="Times New Roman" w:hAnsi="Times New Roman"/>
-          <w:sz w:val="20"/>
-        </w:rPr>
-        <w:t>Análisis de sensibilidad y especificidad por umbral de decisión en el modelo logístico con desbalance de clase. Para uso clínico preventivo, se recomienda umbral 0.10, sacrificando especificidad a favor de no perder detecciones de alto riesgo.</w:t>
+        <w:t>. Análisis de sensibilidad y especificidad por umbral de decisión en el modelo logístico con desbalance de clase. Para uso clínico preventivo, se recomienda umbral 0.10, sacrificando especificidad a favor de no perder detecciones de alto riesgo.</w:t>
       </w:r>
     </w:p>
     <w:sectPr>
-      <w:footerReference w:type="even" r:id="rId2"/>
-      <w:footerReference w:type="default" r:id="rId3"/>
-      <w:footerReference w:type="first" r:id="rId4"/>
+      <w:footerReference w:type="even" r:id="rId20"/>
+      <w:footerReference w:type="default" r:id="rId21"/>
+      <w:footerReference w:type="first" r:id="rId22"/>
       <w:type w:val="nextPage"/>
       <w:pgSz w:w="11906" w:h="16838"/>
       <w:pgMar w:left="1418" w:right="1418" w:gutter="0" w:header="0" w:top="1418" w:footer="708" w:bottom="1778"/>
@@ -9367,7 +9427,7 @@
         <w:sz w:val="22"/>
         <w:szCs w:val="22"/>
       </w:rPr>
-      <w:t>13</w:t>
+      <w:t>24</w:t>
     </w:r>
     <w:r>
       <w:rPr>
@@ -9419,7 +9479,7 @@
         <w:sz w:val="22"/>
         <w:szCs w:val="22"/>
       </w:rPr>
-      <w:t>13</w:t>
+      <w:t>24</w:t>
     </w:r>
     <w:r>
       <w:rPr>
@@ -9933,8 +9993,8 @@
       <w:u w:val="single"/>
     </w:rPr>
   </w:style>
-  <w:style w:type="character" w:styleId="FootnoteCharactersuser">
-    <w:name w:val="Footnote Characters (user)"/>
+  <w:style w:type="character" w:styleId="FootnoteCharacters">
+    <w:name w:val="Footnote Characters"/>
     <w:uiPriority w:val="99"/>
     <w:semiHidden/>
     <w:unhideWhenUsed/>
@@ -9943,8 +10003,8 @@
       <w:vertAlign w:val="superscript"/>
     </w:rPr>
   </w:style>
-  <w:style w:type="character" w:styleId="FootnoteCharacters">
-    <w:name w:val="Footnote Characters"/>
+  <w:style w:type="character" w:styleId="FootnoteCharactersuser">
+    <w:name w:val="Footnote Characters (user)"/>
     <w:qFormat/>
     <w:rPr>
       <w:vertAlign w:val="superscript"/>
@@ -9968,8 +10028,8 @@
       <w:szCs w:val="20"/>
     </w:rPr>
   </w:style>
-  <w:style w:type="character" w:styleId="EndnoteCharactersuser">
-    <w:name w:val="Endnote Characters (user)"/>
+  <w:style w:type="character" w:styleId="EndnoteCharacters">
+    <w:name w:val="Endnote Characters"/>
     <w:uiPriority w:val="99"/>
     <w:semiHidden/>
     <w:unhideWhenUsed/>
@@ -9978,8 +10038,8 @@
       <w:vertAlign w:val="superscript"/>
     </w:rPr>
   </w:style>
-  <w:style w:type="character" w:styleId="EndnoteCharacters">
-    <w:name w:val="Endnote Characters"/>
+  <w:style w:type="character" w:styleId="EndnoteCharactersuser">
+    <w:name w:val="Endnote Characters (user)"/>
     <w:qFormat/>
     <w:rPr>
       <w:vertAlign w:val="superscript"/>

</xml_diff>